<commit_message>
feat: auto-numbering format panel, Tableau dashboard, seed demo data for all modules
</commit_message>
<xml_diff>
--- a/All Docs/Question answers after complete basic ERP.docx
+++ b/All Docs/Question answers after complete basic ERP.docx
@@ -46,7 +46,15 @@
       </w:r>
       <w:proofErr w:type="spellEnd"/>
       <w:r>
-        <w:t xml:space="preserve"> with little adjustment for each company. ? 2. </w:t>
+        <w:t xml:space="preserve"> with little adjustment for each company</w:t>
+      </w:r>
+      <w:proofErr w:type="gramStart"/>
+      <w:r>
+        <w:t>. ?</w:t>
+      </w:r>
+      <w:proofErr w:type="gramEnd"/>
+      <w:r>
+        <w:t xml:space="preserve"> 2. </w:t>
       </w:r>
       <w:proofErr w:type="spellStart"/>
       <w:r>
@@ -62,7 +70,15 @@
       </w:r>
       <w:proofErr w:type="spellEnd"/>
       <w:r>
-        <w:t xml:space="preserve"> cost now ? or shall we do </w:t>
+        <w:t xml:space="preserve"> cost </w:t>
+      </w:r>
+      <w:proofErr w:type="gramStart"/>
+      <w:r>
+        <w:t>now ?</w:t>
+      </w:r>
+      <w:proofErr w:type="gramEnd"/>
+      <w:r>
+        <w:t xml:space="preserve"> or shall we do </w:t>
       </w:r>
       <w:proofErr w:type="spellStart"/>
       <w:r>
@@ -70,7 +86,15 @@
       </w:r>
       <w:proofErr w:type="spellEnd"/>
       <w:r>
-        <w:t xml:space="preserve"> after got the customer ? 3. </w:t>
+        <w:t xml:space="preserve"> after got the </w:t>
+      </w:r>
+      <w:proofErr w:type="gramStart"/>
+      <w:r>
+        <w:t>customer ?</w:t>
+      </w:r>
+      <w:proofErr w:type="gramEnd"/>
+      <w:r>
+        <w:t xml:space="preserve"> 3. </w:t>
       </w:r>
       <w:proofErr w:type="spellStart"/>
       <w:r>
@@ -86,8 +110,13 @@
       </w:r>
       <w:proofErr w:type="spellEnd"/>
       <w:r>
-        <w:t xml:space="preserve"> of revision in every page. can we do that ?</w:t>
-      </w:r>
+        <w:t xml:space="preserve"> of revision in every page. can we do </w:t>
+      </w:r>
+      <w:proofErr w:type="gramStart"/>
+      <w:r>
+        <w:t>that ?</w:t>
+      </w:r>
+      <w:proofErr w:type="gramEnd"/>
     </w:p>
     <w:p>
       <w:r>
@@ -202,7 +231,15 @@
         <w:t>Wait until you get a customer.</w:t>
       </w:r>
       <w:r>
-        <w:t xml:space="preserve"> Here's why:</w:t>
+        <w:t xml:space="preserve"> </w:t>
+      </w:r>
+      <w:proofErr w:type="gramStart"/>
+      <w:r>
+        <w:t>Here's</w:t>
+      </w:r>
+      <w:proofErr w:type="gramEnd"/>
+      <w:r>
+        <w:t xml:space="preserve"> why:</w:t>
       </w:r>
     </w:p>
     <w:p>
@@ -213,7 +250,23 @@
         </w:numPr>
       </w:pPr>
       <w:r>
-        <w:t>Right now you're still in development/testing — running locally costs ₹0</w:t>
+        <w:t xml:space="preserve">Right </w:t>
+      </w:r>
+      <w:proofErr w:type="gramStart"/>
+      <w:r>
+        <w:t>now</w:t>
+      </w:r>
+      <w:proofErr w:type="gramEnd"/>
+      <w:r>
+        <w:t xml:space="preserve"> </w:t>
+      </w:r>
+      <w:proofErr w:type="gramStart"/>
+      <w:r>
+        <w:t>you're</w:t>
+      </w:r>
+      <w:proofErr w:type="gramEnd"/>
+      <w:r>
+        <w:t xml:space="preserve"> still in development/testing — running locally costs ₹0</w:t>
       </w:r>
     </w:p>
     <w:p>
@@ -252,8 +305,13 @@
           <w:numId w:val="2"/>
         </w:numPr>
       </w:pPr>
-      <w:r>
-        <w:t>You'd need: a server, a domain name, SSL certificate, PostgreSQL in cloud</w:t>
+      <w:proofErr w:type="gramStart"/>
+      <w:r>
+        <w:t>You'd</w:t>
+      </w:r>
+      <w:proofErr w:type="gramEnd"/>
+      <w:r>
+        <w:t xml:space="preserve"> need: a server, a domain name, SSL certificate, PostgreSQL in cloud</w:t>
       </w:r>
     </w:p>
     <w:p>
@@ -276,7 +334,23 @@
         <w:t>When you get a customer</w:t>
       </w:r>
       <w:r>
-        <w:t>, I'll help you deploy it properly. It's a one-time setup.</w:t>
+        <w:t xml:space="preserve">, </w:t>
+      </w:r>
+      <w:proofErr w:type="gramStart"/>
+      <w:r>
+        <w:t>I'll</w:t>
+      </w:r>
+      <w:proofErr w:type="gramEnd"/>
+      <w:r>
+        <w:t xml:space="preserve"> help you deploy it properly. </w:t>
+      </w:r>
+      <w:proofErr w:type="gramStart"/>
+      <w:r>
+        <w:t>It's</w:t>
+      </w:r>
+      <w:proofErr w:type="gramEnd"/>
+      <w:r>
+        <w:t xml:space="preserve"> a one-time setup.</w:t>
       </w:r>
     </w:p>
     <w:p/>
@@ -293,7 +367,23 @@
     </w:p>
     <w:p>
       <w:r>
-        <w:t>Yes — that's exactly what we'll do next. Tell me:</w:t>
+        <w:t xml:space="preserve">Yes — </w:t>
+      </w:r>
+      <w:proofErr w:type="gramStart"/>
+      <w:r>
+        <w:t>that's</w:t>
+      </w:r>
+      <w:proofErr w:type="gramEnd"/>
+      <w:r>
+        <w:t xml:space="preserve"> exactly what </w:t>
+      </w:r>
+      <w:proofErr w:type="gramStart"/>
+      <w:r>
+        <w:t>we'll</w:t>
+      </w:r>
+      <w:proofErr w:type="gramEnd"/>
+      <w:r>
+        <w:t xml:space="preserve"> do next. Tell me:</w:t>
       </w:r>
     </w:p>
     <w:p>
@@ -338,7 +428,15 @@
         <w:t>"change this to look like that"</w:t>
       </w:r>
       <w:r>
-        <w:t xml:space="preserve"> — that works too. We'll go page by page.</w:t>
+        <w:t xml:space="preserve"> — that works too. </w:t>
+      </w:r>
+      <w:proofErr w:type="gramStart"/>
+      <w:r>
+        <w:t>We'll</w:t>
+      </w:r>
+      <w:proofErr w:type="gramEnd"/>
+      <w:r>
+        <w:t xml:space="preserve"> go page by page.</w:t>
       </w:r>
     </w:p>
     <w:p/>
@@ -909,13 +1007,14 @@
         </w:tc>
       </w:tr>
     </w:tbl>
-    <w:p>
-      <w:r>
-        <w:pict w14:anchorId="50D75ECA">
-          <v:rect id="_x0000_i1029" style="width:0;height:1.5pt" o:hralign="center" o:hrstd="t" o:hr="t" fillcolor="#a0a0a0" stroked="f"/>
-        </w:pict>
-      </w:r>
-    </w:p>
+    <w:p/>
+    <w:p/>
+    <w:p/>
+    <w:p/>
+    <w:p/>
+    <w:p/>
+    <w:p/>
+    <w:p/>
     <w:p>
       <w:pPr>
         <w:rPr>
@@ -928,6 +1027,7 @@
           <w:b/>
           <w:bCs/>
         </w:rPr>
+        <w:lastRenderedPageBreak/>
         <w:t>2. Tech Stack (Every Tool Used)</w:t>
       </w:r>
     </w:p>
@@ -1243,7 +1343,6 @@
                 <w:b/>
                 <w:bCs/>
               </w:rPr>
-              <w:lastRenderedPageBreak/>
               <w:t>React Router</w:t>
             </w:r>
           </w:p>
@@ -1295,12 +1394,21 @@
             <w:hideMark/>
           </w:tcPr>
           <w:p>
+            <w:proofErr w:type="gramStart"/>
             <w:r>
               <w:rPr>
                 <w:b/>
                 <w:bCs/>
               </w:rPr>
-              <w:t>fetch()</w:t>
+              <w:t>fetch(</w:t>
+            </w:r>
+            <w:proofErr w:type="gramEnd"/>
+            <w:r>
+              <w:rPr>
+                <w:b/>
+                <w:bCs/>
+              </w:rPr>
+              <w:t>)</w:t>
             </w:r>
           </w:p>
         </w:tc>
@@ -2306,6 +2414,7 @@
     </w:tbl>
     <w:p>
       <w:r>
+        <w:lastRenderedPageBreak/>
         <w:pict w14:anchorId="715C448B">
           <v:rect id="_x0000_i1030" style="width:0;height:1.5pt" o:hralign="center" o:hrstd="t" o:hr="t" fillcolor="#a0a0a0" stroked="f"/>
         </w:pict>
@@ -2322,6 +2431,7 @@
         <w:rPr>
           <w:b/>
           <w:bCs/>
+          <w:highlight w:val="yellow"/>
         </w:rPr>
         <w:t>3. Folder Structure — What Lives Where</w:t>
       </w:r>
@@ -2369,7 +2479,6 @@
     </w:p>
     <w:p>
       <w:r>
-        <w:lastRenderedPageBreak/>
         <w:t xml:space="preserve">│   </w:t>
       </w:r>
       <w:r>
@@ -2831,7 +2940,15 @@
     </w:p>
     <w:p>
       <w:r>
-        <w:t>│   │   │       └── MainLayout.js  ← Sidebar + header</w:t>
+        <w:t xml:space="preserve">│   │   │       └── </w:t>
+      </w:r>
+      <w:proofErr w:type="gramStart"/>
+      <w:r>
+        <w:t>MainLayout.js  ←</w:t>
+      </w:r>
+      <w:proofErr w:type="gramEnd"/>
+      <w:r>
+        <w:t xml:space="preserve"> Sidebar + header</w:t>
       </w:r>
     </w:p>
     <w:p>
@@ -2877,114 +2994,6 @@
       </w:r>
       <w:r>
         <w:t xml:space="preserve"> dashboard/</w:t>
-      </w:r>
-    </w:p>
-    <w:p>
-      <w:r>
-        <w:t xml:space="preserve">│   │       </w:t>
-      </w:r>
-      <w:r>
-        <w:rPr>
-          <w:rFonts w:ascii="MS Gothic" w:eastAsia="MS Gothic" w:hAnsi="MS Gothic" w:cs="MS Gothic" w:hint="eastAsia"/>
-        </w:rPr>
-        <w:t>├</w:t>
-      </w:r>
-      <w:r>
-        <w:rPr>
-          <w:rFonts w:ascii="Calibri" w:hAnsi="Calibri" w:cs="Calibri"/>
-        </w:rPr>
-        <w:t>──</w:t>
-      </w:r>
-      <w:r>
-        <w:t xml:space="preserve"> </w:t>
-      </w:r>
-      <w:proofErr w:type="spellStart"/>
-      <w:r>
-        <w:t>master_data</w:t>
-      </w:r>
-      <w:proofErr w:type="spellEnd"/>
-      <w:r>
-        <w:t>/</w:t>
-      </w:r>
-    </w:p>
-    <w:p>
-      <w:r>
-        <w:t xml:space="preserve">│   │       </w:t>
-      </w:r>
-      <w:r>
-        <w:rPr>
-          <w:rFonts w:ascii="MS Gothic" w:eastAsia="MS Gothic" w:hAnsi="MS Gothic" w:cs="MS Gothic" w:hint="eastAsia"/>
-        </w:rPr>
-        <w:t>├</w:t>
-      </w:r>
-      <w:r>
-        <w:rPr>
-          <w:rFonts w:ascii="Calibri" w:hAnsi="Calibri" w:cs="Calibri"/>
-        </w:rPr>
-        <w:t>──</w:t>
-      </w:r>
-      <w:r>
-        <w:t xml:space="preserve"> inventory/</w:t>
-      </w:r>
-    </w:p>
-    <w:p>
-      <w:r>
-        <w:t xml:space="preserve">│   │       </w:t>
-      </w:r>
-      <w:r>
-        <w:rPr>
-          <w:rFonts w:ascii="MS Gothic" w:eastAsia="MS Gothic" w:hAnsi="MS Gothic" w:cs="MS Gothic" w:hint="eastAsia"/>
-        </w:rPr>
-        <w:t>├</w:t>
-      </w:r>
-      <w:r>
-        <w:rPr>
-          <w:rFonts w:ascii="Calibri" w:hAnsi="Calibri" w:cs="Calibri"/>
-        </w:rPr>
-        <w:t>──</w:t>
-      </w:r>
-      <w:r>
-        <w:t xml:space="preserve"> purchasing/</w:t>
-      </w:r>
-    </w:p>
-    <w:p>
-      <w:r>
-        <w:t xml:space="preserve">│   │       </w:t>
-      </w:r>
-      <w:r>
-        <w:rPr>
-          <w:rFonts w:ascii="MS Gothic" w:eastAsia="MS Gothic" w:hAnsi="MS Gothic" w:cs="MS Gothic" w:hint="eastAsia"/>
-        </w:rPr>
-        <w:t>├</w:t>
-      </w:r>
-      <w:r>
-        <w:rPr>
-          <w:rFonts w:ascii="Calibri" w:hAnsi="Calibri" w:cs="Calibri"/>
-        </w:rPr>
-        <w:t>──</w:t>
-      </w:r>
-      <w:r>
-        <w:t xml:space="preserve"> sales/</w:t>
-      </w:r>
-    </w:p>
-    <w:p>
-      <w:r>
-        <w:t xml:space="preserve">│   │       </w:t>
-      </w:r>
-      <w:r>
-        <w:rPr>
-          <w:rFonts w:ascii="MS Gothic" w:eastAsia="MS Gothic" w:hAnsi="MS Gothic" w:cs="MS Gothic" w:hint="eastAsia"/>
-        </w:rPr>
-        <w:t>├</w:t>
-      </w:r>
-      <w:r>
-        <w:rPr>
-          <w:rFonts w:ascii="Calibri" w:hAnsi="Calibri" w:cs="Calibri"/>
-        </w:rPr>
-        <w:t>──</w:t>
-      </w:r>
-      <w:r>
-        <w:t xml:space="preserve"> finance/</w:t>
       </w:r>
     </w:p>
     <w:p>
@@ -3009,6 +3018,114 @@
       </w:r>
       <w:proofErr w:type="spellStart"/>
       <w:r>
+        <w:t>master_data</w:t>
+      </w:r>
+      <w:proofErr w:type="spellEnd"/>
+      <w:r>
+        <w:t>/</w:t>
+      </w:r>
+    </w:p>
+    <w:p>
+      <w:r>
+        <w:t xml:space="preserve">│   │       </w:t>
+      </w:r>
+      <w:r>
+        <w:rPr>
+          <w:rFonts w:ascii="MS Gothic" w:eastAsia="MS Gothic" w:hAnsi="MS Gothic" w:cs="MS Gothic" w:hint="eastAsia"/>
+        </w:rPr>
+        <w:t>├</w:t>
+      </w:r>
+      <w:r>
+        <w:rPr>
+          <w:rFonts w:ascii="Calibri" w:hAnsi="Calibri" w:cs="Calibri"/>
+        </w:rPr>
+        <w:t>──</w:t>
+      </w:r>
+      <w:r>
+        <w:t xml:space="preserve"> inventory/</w:t>
+      </w:r>
+    </w:p>
+    <w:p>
+      <w:r>
+        <w:t xml:space="preserve">│   │       </w:t>
+      </w:r>
+      <w:r>
+        <w:rPr>
+          <w:rFonts w:ascii="MS Gothic" w:eastAsia="MS Gothic" w:hAnsi="MS Gothic" w:cs="MS Gothic" w:hint="eastAsia"/>
+        </w:rPr>
+        <w:t>├</w:t>
+      </w:r>
+      <w:r>
+        <w:rPr>
+          <w:rFonts w:ascii="Calibri" w:hAnsi="Calibri" w:cs="Calibri"/>
+        </w:rPr>
+        <w:t>──</w:t>
+      </w:r>
+      <w:r>
+        <w:t xml:space="preserve"> purchasing/</w:t>
+      </w:r>
+    </w:p>
+    <w:p>
+      <w:r>
+        <w:t xml:space="preserve">│   │       </w:t>
+      </w:r>
+      <w:r>
+        <w:rPr>
+          <w:rFonts w:ascii="MS Gothic" w:eastAsia="MS Gothic" w:hAnsi="MS Gothic" w:cs="MS Gothic" w:hint="eastAsia"/>
+        </w:rPr>
+        <w:t>├</w:t>
+      </w:r>
+      <w:r>
+        <w:rPr>
+          <w:rFonts w:ascii="Calibri" w:hAnsi="Calibri" w:cs="Calibri"/>
+        </w:rPr>
+        <w:t>──</w:t>
+      </w:r>
+      <w:r>
+        <w:t xml:space="preserve"> sales/</w:t>
+      </w:r>
+    </w:p>
+    <w:p>
+      <w:r>
+        <w:t xml:space="preserve">│   │       </w:t>
+      </w:r>
+      <w:r>
+        <w:rPr>
+          <w:rFonts w:ascii="MS Gothic" w:eastAsia="MS Gothic" w:hAnsi="MS Gothic" w:cs="MS Gothic" w:hint="eastAsia"/>
+        </w:rPr>
+        <w:t>├</w:t>
+      </w:r>
+      <w:r>
+        <w:rPr>
+          <w:rFonts w:ascii="Calibri" w:hAnsi="Calibri" w:cs="Calibri"/>
+        </w:rPr>
+        <w:t>──</w:t>
+      </w:r>
+      <w:r>
+        <w:t xml:space="preserve"> finance/</w:t>
+      </w:r>
+    </w:p>
+    <w:p>
+      <w:r>
+        <w:t xml:space="preserve">│   │       </w:t>
+      </w:r>
+      <w:r>
+        <w:rPr>
+          <w:rFonts w:ascii="MS Gothic" w:eastAsia="MS Gothic" w:hAnsi="MS Gothic" w:cs="MS Gothic" w:hint="eastAsia"/>
+        </w:rPr>
+        <w:t>├</w:t>
+      </w:r>
+      <w:r>
+        <w:rPr>
+          <w:rFonts w:ascii="Calibri" w:hAnsi="Calibri" w:cs="Calibri"/>
+        </w:rPr>
+        <w:t>──</w:t>
+      </w:r>
+      <w:r>
+        <w:t xml:space="preserve"> </w:t>
+      </w:r>
+      <w:proofErr w:type="spellStart"/>
+      <w:r>
         <w:t>hr_payroll</w:t>
       </w:r>
       <w:proofErr w:type="spellEnd"/>
@@ -3102,10 +3219,12 @@
         <w:t xml:space="preserve">│   └── </w:t>
       </w:r>
       <w:proofErr w:type="spellStart"/>
+      <w:proofErr w:type="gramStart"/>
       <w:r>
         <w:t>package.json</w:t>
       </w:r>
       <w:proofErr w:type="spellEnd"/>
+      <w:proofErr w:type="gramEnd"/>
       <w:r>
         <w:t xml:space="preserve">            ← All frontend dependencies listed</w:t>
       </w:r>
@@ -3345,8 +3464,13 @@
           </w:tcPr>
           <w:p>
             <w:r>
-              <w:t>/login</w:t>
-            </w:r>
+              <w:t>/</w:t>
+            </w:r>
+            <w:proofErr w:type="gramStart"/>
+            <w:r>
+              <w:t>login</w:t>
+            </w:r>
+            <w:proofErr w:type="gramEnd"/>
           </w:p>
         </w:tc>
         <w:tc>
@@ -3571,8 +3695,13 @@
           </w:tcPr>
           <w:p>
             <w:r>
-              <w:t>/dashboard</w:t>
-            </w:r>
+              <w:t>/</w:t>
+            </w:r>
+            <w:proofErr w:type="gramStart"/>
+            <w:r>
+              <w:t>dashboard</w:t>
+            </w:r>
+            <w:proofErr w:type="gramEnd"/>
           </w:p>
         </w:tc>
         <w:tc>
@@ -3797,7 +3926,15 @@
           </w:tcPr>
           <w:p>
             <w:r>
-              <w:t>/master-data/items</w:t>
+              <w:t>/</w:t>
+            </w:r>
+            <w:proofErr w:type="gramStart"/>
+            <w:r>
+              <w:t>master</w:t>
+            </w:r>
+            <w:proofErr w:type="gramEnd"/>
+            <w:r>
+              <w:t>-data/items</w:t>
             </w:r>
           </w:p>
         </w:tc>
@@ -3874,7 +4011,15 @@
           </w:tcPr>
           <w:p>
             <w:r>
-              <w:t>/master-data/suppliers</w:t>
+              <w:t>/</w:t>
+            </w:r>
+            <w:proofErr w:type="gramStart"/>
+            <w:r>
+              <w:t>master</w:t>
+            </w:r>
+            <w:proofErr w:type="gramEnd"/>
+            <w:r>
+              <w:t>-data/suppliers</w:t>
             </w:r>
           </w:p>
         </w:tc>
@@ -3951,7 +4096,15 @@
           </w:tcPr>
           <w:p>
             <w:r>
-              <w:t>/master-data/customers</w:t>
+              <w:t>/</w:t>
+            </w:r>
+            <w:proofErr w:type="gramStart"/>
+            <w:r>
+              <w:t>master</w:t>
+            </w:r>
+            <w:proofErr w:type="gramEnd"/>
+            <w:r>
+              <w:t>-data/customers</w:t>
             </w:r>
           </w:p>
         </w:tc>
@@ -4003,6 +4156,7 @@
           </w:tcPr>
           <w:p>
             <w:r>
+              <w:lastRenderedPageBreak/>
               <w:t>Warehouses</w:t>
             </w:r>
           </w:p>
@@ -4028,7 +4182,15 @@
           </w:tcPr>
           <w:p>
             <w:r>
-              <w:t>/master-data/warehouses</w:t>
+              <w:t>/</w:t>
+            </w:r>
+            <w:proofErr w:type="gramStart"/>
+            <w:r>
+              <w:t>master</w:t>
+            </w:r>
+            <w:proofErr w:type="gramEnd"/>
+            <w:r>
+              <w:t>-data/warehouses</w:t>
             </w:r>
           </w:p>
         </w:tc>
@@ -4374,7 +4536,6 @@
           <w:b/>
           <w:bCs/>
         </w:rPr>
-        <w:lastRenderedPageBreak/>
         <w:t>Purchasing (2)</w:t>
       </w:r>
     </w:p>
@@ -5544,7 +5705,15 @@
           </w:tcPr>
           <w:p>
             <w:r>
-              <w:t>/hr-payroll/employees</w:t>
+              <w:t>/</w:t>
+            </w:r>
+            <w:proofErr w:type="gramStart"/>
+            <w:r>
+              <w:t>hr</w:t>
+            </w:r>
+            <w:proofErr w:type="gramEnd"/>
+            <w:r>
+              <w:t>-payroll/employees</w:t>
             </w:r>
           </w:p>
         </w:tc>
@@ -5621,7 +5790,15 @@
           </w:tcPr>
           <w:p>
             <w:r>
-              <w:t>/hr-payroll/attendance</w:t>
+              <w:t>/</w:t>
+            </w:r>
+            <w:proofErr w:type="gramStart"/>
+            <w:r>
+              <w:t>hr</w:t>
+            </w:r>
+            <w:proofErr w:type="gramEnd"/>
+            <w:r>
+              <w:t>-payroll/attendance</w:t>
             </w:r>
           </w:p>
         </w:tc>
@@ -5698,7 +5875,15 @@
           </w:tcPr>
           <w:p>
             <w:r>
-              <w:t>/hr-payroll/salary</w:t>
+              <w:t>/</w:t>
+            </w:r>
+            <w:proofErr w:type="gramStart"/>
+            <w:r>
+              <w:t>hr</w:t>
+            </w:r>
+            <w:proofErr w:type="gramEnd"/>
+            <w:r>
+              <w:t>-payroll/salary</w:t>
             </w:r>
           </w:p>
         </w:tc>
@@ -5802,6 +5987,7 @@
                 <w:b/>
                 <w:bCs/>
               </w:rPr>
+              <w:lastRenderedPageBreak/>
               <w:t>Page</w:t>
             </w:r>
           </w:p>
@@ -6182,7 +6368,6 @@
                 <w:b/>
                 <w:bCs/>
               </w:rPr>
-              <w:lastRenderedPageBreak/>
               <w:t>Page</w:t>
             </w:r>
           </w:p>
@@ -6305,7 +6490,15 @@
           </w:tcPr>
           <w:p>
             <w:r>
-              <w:t>/technical-textile/product-categories</w:t>
+              <w:t>/</w:t>
+            </w:r>
+            <w:proofErr w:type="gramStart"/>
+            <w:r>
+              <w:t>technical</w:t>
+            </w:r>
+            <w:proofErr w:type="gramEnd"/>
+            <w:r>
+              <w:t>-textile/product-categories</w:t>
             </w:r>
           </w:p>
         </w:tc>
@@ -6390,7 +6583,15 @@
           </w:tcPr>
           <w:p>
             <w:r>
-              <w:t>/technical-textile/performance-specs</w:t>
+              <w:t>/</w:t>
+            </w:r>
+            <w:proofErr w:type="gramStart"/>
+            <w:r>
+              <w:t>technical</w:t>
+            </w:r>
+            <w:proofErr w:type="gramEnd"/>
+            <w:r>
+              <w:t>-textile/performance-specs</w:t>
             </w:r>
           </w:p>
         </w:tc>
@@ -6467,7 +6668,15 @@
           </w:tcPr>
           <w:p>
             <w:r>
-              <w:t>/technical-textile/samples</w:t>
+              <w:t>/</w:t>
+            </w:r>
+            <w:proofErr w:type="gramStart"/>
+            <w:r>
+              <w:t>technical</w:t>
+            </w:r>
+            <w:proofErr w:type="gramEnd"/>
+            <w:r>
+              <w:t>-textile/samples</w:t>
             </w:r>
           </w:p>
         </w:tc>
@@ -6544,7 +6753,15 @@
           </w:tcPr>
           <w:p>
             <w:r>
-              <w:t>/technical-textile/data-sheets</w:t>
+              <w:t>/</w:t>
+            </w:r>
+            <w:proofErr w:type="gramStart"/>
+            <w:r>
+              <w:t>technical</w:t>
+            </w:r>
+            <w:proofErr w:type="gramEnd"/>
+            <w:r>
+              <w:t>-textile/data-sheets</w:t>
             </w:r>
           </w:p>
         </w:tc>
@@ -6621,7 +6838,15 @@
           </w:tcPr>
           <w:p>
             <w:r>
-              <w:t>/technical-textile/testing-lab</w:t>
+              <w:t>/</w:t>
+            </w:r>
+            <w:proofErr w:type="gramStart"/>
+            <w:r>
+              <w:t>technical</w:t>
+            </w:r>
+            <w:proofErr w:type="gramEnd"/>
+            <w:r>
+              <w:t>-textile/testing-lab</w:t>
             </w:r>
           </w:p>
         </w:tc>
@@ -6698,7 +6923,15 @@
           </w:tcPr>
           <w:p>
             <w:r>
-              <w:t>/technical-textile/</w:t>
+              <w:t>/</w:t>
+            </w:r>
+            <w:proofErr w:type="gramStart"/>
+            <w:r>
+              <w:t>technical</w:t>
+            </w:r>
+            <w:proofErr w:type="gramEnd"/>
+            <w:r>
+              <w:t>-textile/</w:t>
             </w:r>
             <w:proofErr w:type="spellStart"/>
             <w:r>
@@ -6932,7 +7165,15 @@
           </w:tcPr>
           <w:p>
             <w:r>
-              <w:t>/medical-textile/compliance</w:t>
+              <w:t>/</w:t>
+            </w:r>
+            <w:proofErr w:type="gramStart"/>
+            <w:r>
+              <w:t>medical</w:t>
+            </w:r>
+            <w:proofErr w:type="gramEnd"/>
+            <w:r>
+              <w:t>-textile/compliance</w:t>
             </w:r>
           </w:p>
         </w:tc>
@@ -7009,7 +7250,15 @@
           </w:tcPr>
           <w:p>
             <w:r>
-              <w:t>/medical-textile/batch-traceability</w:t>
+              <w:t>/</w:t>
+            </w:r>
+            <w:proofErr w:type="gramStart"/>
+            <w:r>
+              <w:t>medical</w:t>
+            </w:r>
+            <w:proofErr w:type="gramEnd"/>
+            <w:r>
+              <w:t>-textile/batch-traceability</w:t>
             </w:r>
           </w:p>
         </w:tc>
@@ -7086,7 +7335,15 @@
           </w:tcPr>
           <w:p>
             <w:r>
-              <w:t>/medical-textile/sterility</w:t>
+              <w:t>/</w:t>
+            </w:r>
+            <w:proofErr w:type="gramStart"/>
+            <w:r>
+              <w:t>medical</w:t>
+            </w:r>
+            <w:proofErr w:type="gramEnd"/>
+            <w:r>
+              <w:t>-textile/sterility</w:t>
             </w:r>
           </w:p>
         </w:tc>
@@ -7163,7 +7420,15 @@
           </w:tcPr>
           <w:p>
             <w:r>
-              <w:t>/medical-textile/</w:t>
+              <w:t>/</w:t>
+            </w:r>
+            <w:proofErr w:type="gramStart"/>
+            <w:r>
+              <w:t>medical</w:t>
+            </w:r>
+            <w:proofErr w:type="gramEnd"/>
+            <w:r>
+              <w:t>-textile/</w:t>
             </w:r>
             <w:proofErr w:type="spellStart"/>
             <w:r>
@@ -7245,7 +7510,15 @@
           </w:tcPr>
           <w:p>
             <w:r>
-              <w:t>/medical-textile/audit-trail</w:t>
+              <w:t>/</w:t>
+            </w:r>
+            <w:proofErr w:type="gramStart"/>
+            <w:r>
+              <w:t>medical</w:t>
+            </w:r>
+            <w:proofErr w:type="gramEnd"/>
+            <w:r>
+              <w:t>-textile/audit-trail</w:t>
             </w:r>
           </w:p>
         </w:tc>
@@ -7296,33 +7569,46 @@
             <w:hideMark/>
           </w:tcPr>
           <w:p>
-            <w:r>
-              <w:t>Shelf Life Tracking</w:t>
-            </w:r>
-          </w:p>
-        </w:tc>
-        <w:tc>
-          <w:tcPr>
-            <w:tcW w:w="0" w:type="auto"/>
-            <w:tcBorders>
-              <w:top w:val="single" w:sz="4" w:space="0" w:color="2A2B2C"/>
-              <w:left w:val="single" w:sz="4" w:space="0" w:color="2A2B2C"/>
-              <w:bottom w:val="single" w:sz="4" w:space="0" w:color="2A2B2C"/>
-              <w:right w:val="single" w:sz="4" w:space="0" w:color="2A2B2C"/>
-            </w:tcBorders>
-            <w:shd w:val="clear" w:color="auto" w:fill="191A1B"/>
-            <w:tcMar>
-              <w:top w:w="30" w:type="dxa"/>
-              <w:left w:w="30" w:type="dxa"/>
-              <w:bottom w:w="30" w:type="dxa"/>
-              <w:right w:w="30" w:type="dxa"/>
-            </w:tcMar>
-            <w:vAlign w:val="center"/>
-            <w:hideMark/>
-          </w:tcPr>
-          <w:p>
-            <w:r>
-              <w:t>/medical-textile/shelf-life</w:t>
+            <w:proofErr w:type="gramStart"/>
+            <w:r>
+              <w:t>Shelf Life</w:t>
+            </w:r>
+            <w:proofErr w:type="gramEnd"/>
+            <w:r>
+              <w:t xml:space="preserve"> Tracking</w:t>
+            </w:r>
+          </w:p>
+        </w:tc>
+        <w:tc>
+          <w:tcPr>
+            <w:tcW w:w="0" w:type="auto"/>
+            <w:tcBorders>
+              <w:top w:val="single" w:sz="4" w:space="0" w:color="2A2B2C"/>
+              <w:left w:val="single" w:sz="4" w:space="0" w:color="2A2B2C"/>
+              <w:bottom w:val="single" w:sz="4" w:space="0" w:color="2A2B2C"/>
+              <w:right w:val="single" w:sz="4" w:space="0" w:color="2A2B2C"/>
+            </w:tcBorders>
+            <w:shd w:val="clear" w:color="auto" w:fill="191A1B"/>
+            <w:tcMar>
+              <w:top w:w="30" w:type="dxa"/>
+              <w:left w:w="30" w:type="dxa"/>
+              <w:bottom w:w="30" w:type="dxa"/>
+              <w:right w:w="30" w:type="dxa"/>
+            </w:tcMar>
+            <w:vAlign w:val="center"/>
+            <w:hideMark/>
+          </w:tcPr>
+          <w:p>
+            <w:r>
+              <w:t>/</w:t>
+            </w:r>
+            <w:proofErr w:type="gramStart"/>
+            <w:r>
+              <w:t>medical</w:t>
+            </w:r>
+            <w:proofErr w:type="gramEnd"/>
+            <w:r>
+              <w:t>-textile/shelf-life</w:t>
             </w:r>
           </w:p>
         </w:tc>
@@ -7426,6 +7712,7 @@
                 <w:b/>
                 <w:bCs/>
               </w:rPr>
+              <w:lastRenderedPageBreak/>
               <w:t>Page</w:t>
             </w:r>
           </w:p>
@@ -7915,7 +8202,6 @@
           <w:b/>
           <w:bCs/>
         </w:rPr>
-        <w:lastRenderedPageBreak/>
         <w:t>5. How APIs Work (Simple Explanation)</w:t>
       </w:r>
     </w:p>
@@ -8763,6 +9049,7 @@
           </w:tcPr>
           <w:p>
             <w:r>
+              <w:lastRenderedPageBreak/>
               <w:t>Suppliers</w:t>
             </w:r>
           </w:p>
@@ -9423,7 +9710,6 @@
           </w:tcPr>
           <w:p>
             <w:r>
-              <w:lastRenderedPageBreak/>
               <w:t>PO Detail</w:t>
             </w:r>
           </w:p>
@@ -9753,8 +10039,13 @@
             <w:hideMark/>
           </w:tcPr>
           <w:p>
-            <w:r>
-              <w:t>SO Deliver</w:t>
+            <w:proofErr w:type="gramStart"/>
+            <w:r>
+              <w:t>SO</w:t>
+            </w:r>
+            <w:proofErr w:type="gramEnd"/>
+            <w:r>
+              <w:t xml:space="preserve"> Deliver</w:t>
             </w:r>
           </w:p>
         </w:tc>
@@ -10642,6 +10933,7 @@
           </w:tcPr>
           <w:p>
             <w:r>
+              <w:lastRenderedPageBreak/>
               <w:t>Work Orders</w:t>
             </w:r>
           </w:p>
@@ -11420,7 +11712,6 @@
           </w:tcPr>
           <w:p>
             <w:r>
-              <w:lastRenderedPageBreak/>
               <w:t>R&amp;D</w:t>
             </w:r>
           </w:p>
@@ -12320,7 +12611,15 @@
     </w:p>
     <w:p>
       <w:r>
-        <w:t>Every module has its own database tables. Here's the complete picture:</w:t>
+        <w:t xml:space="preserve">Every module has its own database tables. </w:t>
+      </w:r>
+      <w:proofErr w:type="gramStart"/>
+      <w:r>
+        <w:t>Here's</w:t>
+      </w:r>
+      <w:proofErr w:type="gramEnd"/>
+      <w:r>
+        <w:t xml:space="preserve"> the complete picture:</w:t>
       </w:r>
     </w:p>
     <w:p>
@@ -12395,6 +12694,7 @@
                 <w:b/>
                 <w:bCs/>
               </w:rPr>
+              <w:lastRenderedPageBreak/>
               <w:t>Table</w:t>
             </w:r>
           </w:p>
@@ -13018,7 +13318,6 @@
                 <w:b/>
                 <w:bCs/>
               </w:rPr>
-              <w:lastRenderedPageBreak/>
               <w:t>Table</w:t>
             </w:r>
           </w:p>
@@ -13769,6 +14068,7 @@
           <w:b/>
           <w:bCs/>
         </w:rPr>
+        <w:lastRenderedPageBreak/>
         <w:t>HR &amp; Payroll</w:t>
       </w:r>
     </w:p>
@@ -14449,7 +14749,6 @@
           <w:b/>
           <w:bCs/>
         </w:rPr>
-        <w:lastRenderedPageBreak/>
         <w:t>Technical Textile</w:t>
       </w:r>
     </w:p>
@@ -15253,6 +15552,7 @@
           </w:tcPr>
           <w:p>
             <w:r>
+              <w:lastRenderedPageBreak/>
               <w:t>CAPA</w:t>
             </w:r>
           </w:p>
@@ -15493,8 +15793,13 @@
       </w:r>
     </w:p>
     <w:p>
-      <w:r>
-        <w:t>SO status = "Draft" → confirm → status = "Confirmed"</w:t>
+      <w:proofErr w:type="gramStart"/>
+      <w:r>
+        <w:t>SO</w:t>
+      </w:r>
+      <w:proofErr w:type="gramEnd"/>
+      <w:r>
+        <w:t xml:space="preserve"> status = "Draft" → confirm → status = "Confirmed"</w:t>
       </w:r>
     </w:p>
     <w:p>
@@ -15509,88 +15814,93 @@
     </w:p>
     <w:p>
       <w:r>
+        <w:t xml:space="preserve">        ↓</w:t>
+      </w:r>
+    </w:p>
+    <w:p>
+      <w:proofErr w:type="gramStart"/>
+      <w:r>
+        <w:t>SO</w:t>
+      </w:r>
+      <w:proofErr w:type="gramEnd"/>
+      <w:r>
+        <w:t xml:space="preserve"> status = "Delivered"</w:t>
+      </w:r>
+    </w:p>
+    <w:p>
+      <w:r>
+        <w:t xml:space="preserve">        → Stock automatically REDUCED (</w:t>
+      </w:r>
+      <w:proofErr w:type="spellStart"/>
+      <w:r>
+        <w:t>StockMovement</w:t>
+      </w:r>
+      <w:proofErr w:type="spellEnd"/>
+      <w:r>
+        <w:t xml:space="preserve"> created)</w:t>
+      </w:r>
+    </w:p>
+    <w:p>
+      <w:r>
+        <w:t xml:space="preserve">        → </w:t>
+      </w:r>
+      <w:proofErr w:type="spellStart"/>
+      <w:r>
+        <w:t>AuditTrail</w:t>
+      </w:r>
+      <w:proofErr w:type="spellEnd"/>
+      <w:r>
+        <w:t xml:space="preserve"> entry logged (Medical module)</w:t>
+      </w:r>
+    </w:p>
+    <w:p>
+      <w:r>
+        <w:t xml:space="preserve">        ↓</w:t>
+      </w:r>
+    </w:p>
+    <w:p>
+      <w:r>
+        <w:t>Invoice raised against SO</w:t>
+      </w:r>
+    </w:p>
+    <w:p>
+      <w:r>
+        <w:t xml:space="preserve">        ↓</w:t>
+      </w:r>
+    </w:p>
+    <w:p>
+      <w:r>
+        <w:t>Payment received → Invoice status = "Paid"</w:t>
+      </w:r>
+    </w:p>
+    <w:p>
+      <w:r>
+        <w:t xml:space="preserve">        ↓</w:t>
+      </w:r>
+    </w:p>
+    <w:p>
+      <w:r>
+        <w:t>Finance: Journal Entry auto-suggested</w:t>
+      </w:r>
+    </w:p>
+    <w:p>
+      <w:r>
+        <w:t xml:space="preserve">         Debit: Bank Account</w:t>
+      </w:r>
+    </w:p>
+    <w:p>
+      <w:r>
+        <w:t xml:space="preserve">         Credit: Sales Account</w:t>
+      </w:r>
+    </w:p>
+    <w:p>
+      <w:r>
+        <w:t>Same logic for Purchase (receive goods → stock increases) and Production (consume raw materials → finished goods added).</w:t>
+      </w:r>
+    </w:p>
+    <w:p>
+      <w:r>
         <w:lastRenderedPageBreak/>
-        <w:t xml:space="preserve">        ↓</w:t>
-      </w:r>
-    </w:p>
-    <w:p>
-      <w:r>
-        <w:t>SO status = "Delivered"</w:t>
-      </w:r>
-    </w:p>
-    <w:p>
-      <w:r>
-        <w:t xml:space="preserve">        → Stock automatically REDUCED (</w:t>
-      </w:r>
-      <w:proofErr w:type="spellStart"/>
-      <w:r>
-        <w:t>StockMovement</w:t>
-      </w:r>
-      <w:proofErr w:type="spellEnd"/>
-      <w:r>
-        <w:t xml:space="preserve"> created)</w:t>
-      </w:r>
-    </w:p>
-    <w:p>
-      <w:r>
-        <w:t xml:space="preserve">        → </w:t>
-      </w:r>
-      <w:proofErr w:type="spellStart"/>
-      <w:r>
-        <w:t>AuditTrail</w:t>
-      </w:r>
-      <w:proofErr w:type="spellEnd"/>
-      <w:r>
-        <w:t xml:space="preserve"> entry logged (Medical module)</w:t>
-      </w:r>
-    </w:p>
-    <w:p>
-      <w:r>
-        <w:t xml:space="preserve">        ↓</w:t>
-      </w:r>
-    </w:p>
-    <w:p>
-      <w:r>
-        <w:t>Invoice raised against SO</w:t>
-      </w:r>
-    </w:p>
-    <w:p>
-      <w:r>
-        <w:t xml:space="preserve">        ↓</w:t>
-      </w:r>
-    </w:p>
-    <w:p>
-      <w:r>
-        <w:t>Payment received → Invoice status = "Paid"</w:t>
-      </w:r>
-    </w:p>
-    <w:p>
-      <w:r>
-        <w:t xml:space="preserve">        ↓</w:t>
-      </w:r>
-    </w:p>
-    <w:p>
-      <w:r>
-        <w:t>Finance: Journal Entry auto-suggested</w:t>
-      </w:r>
-    </w:p>
-    <w:p>
-      <w:r>
-        <w:t xml:space="preserve">         Debit: Bank Account</w:t>
-      </w:r>
-    </w:p>
-    <w:p>
-      <w:r>
-        <w:t xml:space="preserve">         Credit: Sales Account</w:t>
-      </w:r>
-    </w:p>
-    <w:p>
-      <w:r>
-        <w:t>Same logic for Purchase (receive goods → stock increases) and Production (consume raw materials → finished goods added).</w:t>
-      </w:r>
-    </w:p>
-    <w:p>
-      <w:r>
         <w:pict w14:anchorId="7E5646B5">
           <v:rect id="_x0000_i1035" style="width:0;height:1.5pt" o:hralign="center" o:hrstd="t" o:hr="t" fillcolor="#a0a0a0" stroked="f"/>
         </w:pict>
@@ -16330,7 +16640,6 @@
           </w:tcPr>
           <w:p>
             <w:r>
-              <w:lastRenderedPageBreak/>
               <w:t>Session-based auth</w:t>
             </w:r>
           </w:p>
@@ -16529,7 +16838,15 @@
         <w:t>Current limitation:</w:t>
       </w:r>
       <w:r>
-        <w:t xml:space="preserve"> No role-based access yet (admin vs staff vs viewer). That's a future upgrade.</w:t>
+        <w:t xml:space="preserve"> No role-based access yet (admin vs staff vs viewer). </w:t>
+      </w:r>
+      <w:proofErr w:type="gramStart"/>
+      <w:r>
+        <w:t>That's</w:t>
+      </w:r>
+      <w:proofErr w:type="gramEnd"/>
+      <w:r>
+        <w:t xml:space="preserve"> a future upgrade.</w:t>
       </w:r>
     </w:p>
     <w:p>
@@ -16940,6 +17257,7 @@
           </w:tcPr>
           <w:p>
             <w:r>
+              <w:lastRenderedPageBreak/>
               <w:t>Sales</w:t>
             </w:r>
           </w:p>
@@ -17375,7 +17693,15 @@
           </w:tcPr>
           <w:p>
             <w:r>
-              <w:t>Expiring certs, open CAPAs, shelf life alerts</w:t>
+              <w:t xml:space="preserve">Expiring certs, open CAPAs, </w:t>
+            </w:r>
+            <w:proofErr w:type="gramStart"/>
+            <w:r>
+              <w:t>shelf life</w:t>
+            </w:r>
+            <w:proofErr w:type="gramEnd"/>
+            <w:r>
+              <w:t xml:space="preserve"> alerts</w:t>
             </w:r>
           </w:p>
         </w:tc>
@@ -17542,7 +17868,6 @@
                 <w:b/>
                 <w:bCs/>
               </w:rPr>
-              <w:lastRenderedPageBreak/>
               <w:t>Feature</w:t>
             </w:r>
           </w:p>
@@ -18080,7 +18405,24 @@
           <w:i/>
           <w:iCs/>
         </w:rPr>
-        <w:t>"This is a purpose-built ERP for textile manufacturers — specifically for companies making technical and medical textiles. It covers your entire operation: procurement, inventory, production with BOM and batch tracking, HR and payroll, finance, and full medical textile compliance including ISO 13485, CAPA, batch traceability, and shelf life monitoring. It runs in the browser, works on your internal network, and is built to be customized for your specific workflows."</w:t>
+        <w:lastRenderedPageBreak/>
+        <w:t xml:space="preserve">"This is a purpose-built ERP for textile manufacturers — specifically for companies making technical and medical textiles. It covers your entire operation: procurement, inventory, production with BOM and batch tracking, HR and payroll, finance, and full medical textile compliance including ISO 13485, CAPA, batch traceability, and </w:t>
+      </w:r>
+      <w:proofErr w:type="gramStart"/>
+      <w:r>
+        <w:rPr>
+          <w:i/>
+          <w:iCs/>
+        </w:rPr>
+        <w:t>shelf life</w:t>
+      </w:r>
+      <w:proofErr w:type="gramEnd"/>
+      <w:r>
+        <w:rPr>
+          <w:i/>
+          <w:iCs/>
+        </w:rPr>
+        <w:t xml:space="preserve"> monitoring. It runs in the browser, works on your internal network, and is built to be customized for your specific workflows."</w:t>
       </w:r>
     </w:p>
     <w:p>
@@ -18111,7 +18453,15 @@
         </w:numPr>
       </w:pPr>
       <w:r>
-        <w:t>Medical textile compliance built-in (most ERPs don't have this)</w:t>
+        <w:t xml:space="preserve">Medical textile compliance built-in (most ERPs </w:t>
+      </w:r>
+      <w:proofErr w:type="gramStart"/>
+      <w:r>
+        <w:t>don't</w:t>
+      </w:r>
+      <w:proofErr w:type="gramEnd"/>
+      <w:r>
+        <w:t xml:space="preserve"> have this)</w:t>
       </w:r>
     </w:p>
     <w:p>
@@ -18155,19 +18505,39 @@
       </w:r>
     </w:p>
     <w:p>
-      <w:r>
-        <w:t>That's the complete picture. Now you know this product better than most developers who build it.</w:t>
-      </w:r>
-    </w:p>
-    <w:p>
-      <w:r>
-        <w:t>When you're ready — tell me which page to revise first and what you want changed.</w:t>
-      </w:r>
-    </w:p>
-    <w:p>
-      <w:r>
-        <w:lastRenderedPageBreak/>
-        <w:t>Now follow these steps — I'll guide you one by one:</w:t>
+      <w:proofErr w:type="gramStart"/>
+      <w:r>
+        <w:t>That's</w:t>
+      </w:r>
+      <w:proofErr w:type="gramEnd"/>
+      <w:r>
+        <w:t xml:space="preserve"> the complete picture. Now you know this product better than most developers who build it.</w:t>
+      </w:r>
+    </w:p>
+    <w:p>
+      <w:r>
+        <w:t xml:space="preserve">When </w:t>
+      </w:r>
+      <w:proofErr w:type="gramStart"/>
+      <w:r>
+        <w:t>you're</w:t>
+      </w:r>
+      <w:proofErr w:type="gramEnd"/>
+      <w:r>
+        <w:t xml:space="preserve"> ready — tell me which page to revise first and what you want changed.</w:t>
+      </w:r>
+    </w:p>
+    <w:p>
+      <w:r>
+        <w:t xml:space="preserve">Now follow these steps — </w:t>
+      </w:r>
+      <w:proofErr w:type="gramStart"/>
+      <w:r>
+        <w:t>I'll</w:t>
+      </w:r>
+      <w:proofErr w:type="gramEnd"/>
+      <w:r>
+        <w:t xml:space="preserve"> guide you one by one:</w:t>
       </w:r>
     </w:p>
     <w:p>
@@ -18321,13 +18691,18 @@
         <w:t>Do NOT tick</w:t>
       </w:r>
       <w:r>
-        <w:t> "Add README" or "Add .</w:t>
+        <w:t> "Add README" or "</w:t>
+      </w:r>
+      <w:proofErr w:type="gramStart"/>
+      <w:r>
+        <w:t>Add .</w:t>
       </w:r>
       <w:proofErr w:type="spellStart"/>
       <w:r>
         <w:t>gitignore</w:t>
       </w:r>
       <w:proofErr w:type="spellEnd"/>
+      <w:proofErr w:type="gramEnd"/>
       <w:r>
         <w:t>" — we already have one</w:t>
       </w:r>
@@ -18390,6 +18765,7 @@
           <w:b/>
           <w:bCs/>
         </w:rPr>
+        <w:lastRenderedPageBreak/>
         <w:t>Step 2 — Come back and tell me the URL</w:t>
       </w:r>
     </w:p>
@@ -18399,8 +18775,13 @@
       </w:r>
     </w:p>
     <w:p>
-      <w:r>
-        <w:t>I'll then run the commands to:</w:t>
+      <w:proofErr w:type="gramStart"/>
+      <w:r>
+        <w:t>I'll</w:t>
+      </w:r>
+      <w:proofErr w:type="gramEnd"/>
+      <w:r>
+        <w:t xml:space="preserve"> then run the commands to:</w:t>
       </w:r>
     </w:p>
     <w:p>
@@ -18461,6 +18842,7 @@
         <w:t>SASI's_ERP</w:t>
       </w:r>
       <w:proofErr w:type="spellEnd"/>
+      <w:proofErr w:type="gramStart"/>
       <w:r>
         <w:t>\.</w:t>
       </w:r>
@@ -18469,11 +18851,25 @@
         <w:t>gitignore</w:t>
       </w:r>
       <w:proofErr w:type="spellEnd"/>
-    </w:p>
-    <w:p>
-      <w:r>
-        <w:t>help me with read me and post their ? can you ?</w:t>
-      </w:r>
+      <w:proofErr w:type="gramEnd"/>
+    </w:p>
+    <w:p>
+      <w:r>
+        <w:t xml:space="preserve">help me with read me and post </w:t>
+      </w:r>
+      <w:proofErr w:type="gramStart"/>
+      <w:r>
+        <w:t>their ?</w:t>
+      </w:r>
+      <w:proofErr w:type="gramEnd"/>
+      <w:r>
+        <w:t xml:space="preserve"> can </w:t>
+      </w:r>
+      <w:proofErr w:type="gramStart"/>
+      <w:r>
+        <w:t>you ?</w:t>
+      </w:r>
+      <w:proofErr w:type="gramEnd"/>
     </w:p>
     <w:p>
       <w:pPr>
@@ -18532,24 +18928,66 @@
     </w:p>
     <w:p>
       <w:r>
+        <w:t>173 lines</w:t>
+      </w:r>
+    </w:p>
+    <w:p>
+      <w:r>
+        <w:t># SASI ERP — Medical &amp; Technical Textile</w:t>
+      </w:r>
+    </w:p>
+    <w:p/>
+    <w:p>
+      <w:r>
+        <w:t xml:space="preserve">A purpose-built Enterprise Resource Planning (ERP) system for **Medical and Technical Textile manufacturers**.  </w:t>
+      </w:r>
+    </w:p>
+    <w:p>
+      <w:r>
+        <w:t>Built with React.js, Django, and PostgreSQL.</w:t>
+      </w:r>
+    </w:p>
+    <w:p/>
+    <w:p>
+      <w:r>
+        <w:t>---</w:t>
+      </w:r>
+    </w:p>
+    <w:p/>
+    <w:p>
+      <w:r>
+        <w:t>## What This Does</w:t>
+      </w:r>
+    </w:p>
+    <w:p/>
+    <w:p>
+      <w:r>
+        <w:t>Most ERPs are generic. This one is built specifically for textile companies that manufacture:</w:t>
+      </w:r>
+    </w:p>
+    <w:p>
+      <w:r>
+        <w:t>- **Medical textiles** — surgical drapes, wound care, implantable fabrics (requires ISO 13485, FDA, CAPA compliance)</w:t>
+      </w:r>
+    </w:p>
+    <w:p>
+      <w:r>
         <w:lastRenderedPageBreak/>
-        <w:t>173 lines</w:t>
-      </w:r>
-    </w:p>
-    <w:p>
-      <w:r>
-        <w:t># SASI ERP — Medical &amp; Technical Textile</w:t>
+        <w:t xml:space="preserve">- **Technical textiles** — geotextiles, </w:t>
+      </w:r>
+      <w:proofErr w:type="spellStart"/>
+      <w:r>
+        <w:t>agrotextiles</w:t>
+      </w:r>
+      <w:proofErr w:type="spellEnd"/>
+      <w:r>
+        <w:t>, filtration, protective fabrics (requires GSM, tensile, performance specs)</w:t>
       </w:r>
     </w:p>
     <w:p/>
     <w:p>
       <w:r>
-        <w:t xml:space="preserve">A purpose-built Enterprise Resource Planning (ERP) system for **Medical and Technical Textile manufacturers**.  </w:t>
-      </w:r>
-    </w:p>
-    <w:p>
-      <w:r>
-        <w:t>Built with React.js, Django, and PostgreSQL.</w:t>
+        <w:t>It covers the **entire business operation** in one system.</w:t>
       </w:r>
     </w:p>
     <w:p/>
@@ -18561,206 +18999,961 @@
     <w:p/>
     <w:p>
       <w:r>
-        <w:t>## What This Does</w:t>
+        <w:t>## Modules</w:t>
       </w:r>
     </w:p>
     <w:p/>
     <w:p>
       <w:r>
-        <w:t>Most ERPs are generic. This one is built specifically for textile companies that manufacture:</w:t>
-      </w:r>
-    </w:p>
-    <w:p>
-      <w:r>
-        <w:t>- **Medical textiles** — surgical drapes, wound care, implantable fabrics (requires ISO 13485, FDA, CAPA compliance)</w:t>
-      </w:r>
-    </w:p>
-    <w:p>
-      <w:r>
-        <w:t xml:space="preserve">- **Technical textiles** — geotextiles, </w:t>
+        <w:t>| Module | What It Covers |</w:t>
+      </w:r>
+    </w:p>
+    <w:p>
+      <w:r>
+        <w:t>|---|---|</w:t>
+      </w:r>
+    </w:p>
+    <w:p>
+      <w:r>
+        <w:t>| **Master Data** | Items, Suppliers, Customers, Warehouses |</w:t>
+      </w:r>
+    </w:p>
+    <w:p>
+      <w:r>
+        <w:t>| **Inventory** | Stock levels, Stock movements (IN/OUT/TRANSFER) |</w:t>
+      </w:r>
+    </w:p>
+    <w:p>
+      <w:r>
+        <w:t xml:space="preserve">| **Purchasing** | Purchase Orders, Supplier management, </w:t>
+      </w:r>
+      <w:proofErr w:type="gramStart"/>
+      <w:r>
+        <w:t>Goods</w:t>
+      </w:r>
+      <w:proofErr w:type="gramEnd"/>
+      <w:r>
+        <w:t xml:space="preserve"> receipt |</w:t>
+      </w:r>
+    </w:p>
+    <w:p>
+      <w:r>
+        <w:t>| **Sales** | Sales Orders, Delivery, Invoice tracking |</w:t>
+      </w:r>
+    </w:p>
+    <w:p>
+      <w:r>
+        <w:t>| **Finance** | Chart of Accounts, Journal Entries, Trial Balance |</w:t>
+      </w:r>
+    </w:p>
+    <w:p>
+      <w:r>
+        <w:t>| **HR &amp; Payroll** | Employees, Attendance, Monthly Salary processing |</w:t>
+      </w:r>
+    </w:p>
+    <w:p>
+      <w:r>
+        <w:t>| **Production** | Bill of Materials, Work Orders, Batch tracking |</w:t>
+      </w:r>
+    </w:p>
+    <w:p>
+      <w:r>
+        <w:t>| **Technical Textile** | Performance Specs, Samples, TDS, Testing Lab, R&amp;D Projects |</w:t>
+      </w:r>
+    </w:p>
+    <w:p>
+      <w:r>
+        <w:t>| **Medical Textile** | Regulatory Compliance, Batch Traceability, Sterility Records, CAPA, Audit Trail, Shelf Life |</w:t>
+      </w:r>
+    </w:p>
+    <w:p>
+      <w:r>
+        <w:t>| **Reports** | Production, Inventory, Sales, Finance, HR reports with charts |</w:t>
+      </w:r>
+    </w:p>
+    <w:p>
+      <w:r>
+        <w:t>| **Dashboard** | Live KPIs, alerts, charts from all modules |</w:t>
+      </w:r>
+    </w:p>
+    <w:p/>
+    <w:p>
+      <w:r>
+        <w:t>**Total: 38 pages across 11 modules**</w:t>
+      </w:r>
+    </w:p>
+    <w:p/>
+    <w:p>
+      <w:r>
+        <w:t>---</w:t>
+      </w:r>
+    </w:p>
+    <w:p/>
+    <w:p>
+      <w:r>
+        <w:t>## Tech Stack</w:t>
+      </w:r>
+    </w:p>
+    <w:p/>
+    <w:p>
+      <w:r>
+        <w:t>### Frontend</w:t>
+      </w:r>
+    </w:p>
+    <w:p>
+      <w:r>
+        <w:t>- **React.js** — UI framework</w:t>
+      </w:r>
+    </w:p>
+    <w:p>
+      <w:r>
+        <w:t>- **Material UI (MUI)** — Component library</w:t>
+      </w:r>
+    </w:p>
+    <w:p>
+      <w:r>
+        <w:t>- **Recharts** — Charts and graphs</w:t>
+      </w:r>
+    </w:p>
+    <w:p>
+      <w:r>
+        <w:t>- **React Router** — Page routing</w:t>
+      </w:r>
+    </w:p>
+    <w:p/>
+    <w:p>
+      <w:r>
+        <w:t>### Backend</w:t>
+      </w:r>
+    </w:p>
+    <w:p>
+      <w:r>
+        <w:t>- **Python 3.x** + **Django** — Web framework</w:t>
+      </w:r>
+    </w:p>
+    <w:p>
+      <w:r>
+        <w:t>- **Django REST Framework** — API layer</w:t>
+      </w:r>
+    </w:p>
+    <w:p>
+      <w:r>
+        <w:t>- **PostgreSQL** — Database</w:t>
+      </w:r>
+    </w:p>
+    <w:p/>
+    <w:p>
+      <w:r>
+        <w:t>### Infrastructure</w:t>
+      </w:r>
+    </w:p>
+    <w:p>
+      <w:r>
+        <w:t>- **Docker + Docker Compose** — Runs PostgreSQL locally</w:t>
+      </w:r>
+    </w:p>
+    <w:p>
+      <w:r>
+        <w:t xml:space="preserve">- **Node.js + </w:t>
       </w:r>
       <w:proofErr w:type="spellStart"/>
       <w:r>
-        <w:t>agrotextiles</w:t>
+        <w:t>npm</w:t>
       </w:r>
       <w:proofErr w:type="spellEnd"/>
       <w:r>
-        <w:t>, filtration, protective fabrics (requires GSM, tensile, performance specs)</w:t>
+        <w:t>** — React development server</w:t>
       </w:r>
     </w:p>
     <w:p/>
     <w:p>
       <w:r>
-        <w:t>It covers the **entire business operation** in one system.</w:t>
+        <w:t>---</w:t>
       </w:r>
     </w:p>
     <w:p/>
     <w:p>
       <w:r>
+        <w:t>## Project Structure</w:t>
+      </w:r>
+    </w:p>
+    <w:p/>
+    <w:p>
+      <w:r>
+        <w:t>```</w:t>
+      </w:r>
+    </w:p>
+    <w:p>
+      <w:proofErr w:type="spellStart"/>
+      <w:r>
+        <w:t>SASI's_ERP</w:t>
+      </w:r>
+      <w:proofErr w:type="spellEnd"/>
+      <w:r>
+        <w:t>/</w:t>
+      </w:r>
+    </w:p>
+    <w:p>
+      <w:r>
+        <w:rPr>
+          <w:rFonts w:ascii="MS Gothic" w:eastAsia="MS Gothic" w:hAnsi="MS Gothic" w:cs="MS Gothic" w:hint="eastAsia"/>
+        </w:rPr>
+        <w:t>├</w:t>
+      </w:r>
+      <w:r>
+        <w:rPr>
+          <w:rFonts w:ascii="Calibri" w:hAnsi="Calibri" w:cs="Calibri"/>
+        </w:rPr>
+        <w:t>──</w:t>
+      </w:r>
+      <w:r>
+        <w:t xml:space="preserve"> backend/                  # Django backend</w:t>
+      </w:r>
+    </w:p>
+    <w:p>
+      <w:r>
+        <w:t xml:space="preserve">│   </w:t>
+      </w:r>
+      <w:r>
+        <w:rPr>
+          <w:rFonts w:ascii="MS Gothic" w:eastAsia="MS Gothic" w:hAnsi="MS Gothic" w:cs="MS Gothic" w:hint="eastAsia"/>
+        </w:rPr>
+        <w:t>├</w:t>
+      </w:r>
+      <w:r>
+        <w:rPr>
+          <w:rFonts w:ascii="Calibri" w:hAnsi="Calibri" w:cs="Calibri"/>
+        </w:rPr>
+        <w:t>──</w:t>
+      </w:r>
+      <w:r>
+        <w:t xml:space="preserve"> core/                 # Settings, main URL router</w:t>
+      </w:r>
+    </w:p>
+    <w:p>
+      <w:r>
+        <w:t xml:space="preserve">│   </w:t>
+      </w:r>
+      <w:r>
+        <w:rPr>
+          <w:rFonts w:ascii="MS Gothic" w:eastAsia="MS Gothic" w:hAnsi="MS Gothic" w:cs="MS Gothic" w:hint="eastAsia"/>
+        </w:rPr>
+        <w:t>├</w:t>
+      </w:r>
+      <w:r>
+        <w:rPr>
+          <w:rFonts w:ascii="Calibri" w:hAnsi="Calibri" w:cs="Calibri"/>
+        </w:rPr>
+        <w:t>──</w:t>
+      </w:r>
+      <w:r>
+        <w:t xml:space="preserve"> authentication/       # Login, logout, dashboard API</w:t>
+      </w:r>
+    </w:p>
+    <w:p>
+      <w:r>
+        <w:t xml:space="preserve">│   </w:t>
+      </w:r>
+      <w:r>
+        <w:rPr>
+          <w:rFonts w:ascii="MS Gothic" w:eastAsia="MS Gothic" w:hAnsi="MS Gothic" w:cs="MS Gothic" w:hint="eastAsia"/>
+        </w:rPr>
+        <w:t>├</w:t>
+      </w:r>
+      <w:r>
+        <w:rPr>
+          <w:rFonts w:ascii="Calibri" w:hAnsi="Calibri" w:cs="Calibri"/>
+        </w:rPr>
+        <w:t>──</w:t>
+      </w:r>
+      <w:r>
+        <w:t xml:space="preserve"> inventory/            # Stock and movements</w:t>
+      </w:r>
+    </w:p>
+    <w:p>
+      <w:r>
+        <w:t xml:space="preserve">│   </w:t>
+      </w:r>
+      <w:r>
+        <w:rPr>
+          <w:rFonts w:ascii="MS Gothic" w:eastAsia="MS Gothic" w:hAnsi="MS Gothic" w:cs="MS Gothic" w:hint="eastAsia"/>
+        </w:rPr>
+        <w:t>├</w:t>
+      </w:r>
+      <w:r>
+        <w:rPr>
+          <w:rFonts w:ascii="Calibri" w:hAnsi="Calibri" w:cs="Calibri"/>
+        </w:rPr>
+        <w:t>──</w:t>
+      </w:r>
+      <w:r>
+        <w:t xml:space="preserve"> purchasing/           # Purchase orders</w:t>
+      </w:r>
+    </w:p>
+    <w:p>
+      <w:r>
+        <w:t xml:space="preserve">│   </w:t>
+      </w:r>
+      <w:r>
+        <w:rPr>
+          <w:rFonts w:ascii="MS Gothic" w:eastAsia="MS Gothic" w:hAnsi="MS Gothic" w:cs="MS Gothic" w:hint="eastAsia"/>
+        </w:rPr>
+        <w:t>├</w:t>
+      </w:r>
+      <w:r>
+        <w:rPr>
+          <w:rFonts w:ascii="Calibri" w:hAnsi="Calibri" w:cs="Calibri"/>
+        </w:rPr>
+        <w:t>──</w:t>
+      </w:r>
+      <w:r>
+        <w:t xml:space="preserve"> sales/                # Sales orders and invoices</w:t>
+      </w:r>
+    </w:p>
+    <w:p>
+      <w:r>
+        <w:lastRenderedPageBreak/>
+        <w:t xml:space="preserve">│   </w:t>
+      </w:r>
+      <w:r>
+        <w:rPr>
+          <w:rFonts w:ascii="MS Gothic" w:eastAsia="MS Gothic" w:hAnsi="MS Gothic" w:cs="MS Gothic" w:hint="eastAsia"/>
+        </w:rPr>
+        <w:t>├</w:t>
+      </w:r>
+      <w:r>
+        <w:rPr>
+          <w:rFonts w:ascii="Calibri" w:hAnsi="Calibri" w:cs="Calibri"/>
+        </w:rPr>
+        <w:t>──</w:t>
+      </w:r>
+      <w:r>
+        <w:t xml:space="preserve"> finance/              # Accounts and journals</w:t>
+      </w:r>
+    </w:p>
+    <w:p>
+      <w:r>
+        <w:t xml:space="preserve">│   </w:t>
+      </w:r>
+      <w:r>
+        <w:rPr>
+          <w:rFonts w:ascii="MS Gothic" w:eastAsia="MS Gothic" w:hAnsi="MS Gothic" w:cs="MS Gothic" w:hint="eastAsia"/>
+        </w:rPr>
+        <w:t>├</w:t>
+      </w:r>
+      <w:r>
+        <w:rPr>
+          <w:rFonts w:ascii="Calibri" w:hAnsi="Calibri" w:cs="Calibri"/>
+        </w:rPr>
+        <w:t>──</w:t>
+      </w:r>
+      <w:r>
+        <w:t xml:space="preserve"> </w:t>
+      </w:r>
+      <w:proofErr w:type="spellStart"/>
+      <w:r>
+        <w:t>hr_payroll</w:t>
+      </w:r>
+      <w:proofErr w:type="spellEnd"/>
+      <w:r>
+        <w:t>/           # Employees, attendance, salary</w:t>
+      </w:r>
+    </w:p>
+    <w:p>
+      <w:r>
+        <w:t xml:space="preserve">│   </w:t>
+      </w:r>
+      <w:r>
+        <w:rPr>
+          <w:rFonts w:ascii="MS Gothic" w:eastAsia="MS Gothic" w:hAnsi="MS Gothic" w:cs="MS Gothic" w:hint="eastAsia"/>
+        </w:rPr>
+        <w:t>├</w:t>
+      </w:r>
+      <w:r>
+        <w:rPr>
+          <w:rFonts w:ascii="Calibri" w:hAnsi="Calibri" w:cs="Calibri"/>
+        </w:rPr>
+        <w:t>──</w:t>
+      </w:r>
+      <w:r>
+        <w:t xml:space="preserve"> production/           # BOM and work orders</w:t>
+      </w:r>
+    </w:p>
+    <w:p>
+      <w:r>
+        <w:t xml:space="preserve">│   </w:t>
+      </w:r>
+      <w:r>
+        <w:rPr>
+          <w:rFonts w:ascii="MS Gothic" w:eastAsia="MS Gothic" w:hAnsi="MS Gothic" w:cs="MS Gothic" w:hint="eastAsia"/>
+        </w:rPr>
+        <w:t>├</w:t>
+      </w:r>
+      <w:r>
+        <w:rPr>
+          <w:rFonts w:ascii="Calibri" w:hAnsi="Calibri" w:cs="Calibri"/>
+        </w:rPr>
+        <w:t>──</w:t>
+      </w:r>
+      <w:r>
+        <w:t xml:space="preserve"> </w:t>
+      </w:r>
+      <w:proofErr w:type="spellStart"/>
+      <w:r>
+        <w:t>technical_textile</w:t>
+      </w:r>
+      <w:proofErr w:type="spellEnd"/>
+      <w:r>
+        <w:t>/    # Specs, samples, lab, R&amp;D</w:t>
+      </w:r>
+    </w:p>
+    <w:p>
+      <w:r>
+        <w:t xml:space="preserve">│   </w:t>
+      </w:r>
+      <w:r>
+        <w:rPr>
+          <w:rFonts w:ascii="MS Gothic" w:eastAsia="MS Gothic" w:hAnsi="MS Gothic" w:cs="MS Gothic" w:hint="eastAsia"/>
+        </w:rPr>
+        <w:t>├</w:t>
+      </w:r>
+      <w:r>
+        <w:rPr>
+          <w:rFonts w:ascii="Calibri" w:hAnsi="Calibri" w:cs="Calibri"/>
+        </w:rPr>
+        <w:t>──</w:t>
+      </w:r>
+      <w:r>
+        <w:t xml:space="preserve"> </w:t>
+      </w:r>
+      <w:proofErr w:type="spellStart"/>
+      <w:r>
+        <w:t>medical_textile</w:t>
+      </w:r>
+      <w:proofErr w:type="spellEnd"/>
+      <w:r>
+        <w:t>/      # Compliance, CAPA, traceability</w:t>
+      </w:r>
+    </w:p>
+    <w:p>
+      <w:r>
+        <w:t>│   └── reports/              # Report APIs</w:t>
+      </w:r>
+    </w:p>
+    <w:p>
+      <w:r>
+        <w:t>│</w:t>
+      </w:r>
+    </w:p>
+    <w:p>
+      <w:r>
+        <w:rPr>
+          <w:rFonts w:ascii="MS Gothic" w:eastAsia="MS Gothic" w:hAnsi="MS Gothic" w:cs="MS Gothic" w:hint="eastAsia"/>
+        </w:rPr>
+        <w:t>├</w:t>
+      </w:r>
+      <w:r>
+        <w:rPr>
+          <w:rFonts w:ascii="Calibri" w:hAnsi="Calibri" w:cs="Calibri"/>
+        </w:rPr>
+        <w:t>──</w:t>
+      </w:r>
+      <w:r>
+        <w:t xml:space="preserve"> frontend/                 # React frontend</w:t>
+      </w:r>
+    </w:p>
+    <w:p>
+      <w:r>
+        <w:t xml:space="preserve">│   └── </w:t>
+      </w:r>
+      <w:proofErr w:type="spellStart"/>
+      <w:r>
+        <w:t>src</w:t>
+      </w:r>
+      <w:proofErr w:type="spellEnd"/>
+      <w:r>
+        <w:t>/</w:t>
+      </w:r>
+    </w:p>
+    <w:p>
+      <w:r>
+        <w:t xml:space="preserve">│       </w:t>
+      </w:r>
+      <w:r>
+        <w:rPr>
+          <w:rFonts w:ascii="MS Gothic" w:eastAsia="MS Gothic" w:hAnsi="MS Gothic" w:cs="MS Gothic" w:hint="eastAsia"/>
+        </w:rPr>
+        <w:t>├</w:t>
+      </w:r>
+      <w:r>
+        <w:rPr>
+          <w:rFonts w:ascii="Calibri" w:hAnsi="Calibri" w:cs="Calibri"/>
+        </w:rPr>
+        <w:t>──</w:t>
+      </w:r>
+      <w:r>
+        <w:t xml:space="preserve"> App.js            # All routes</w:t>
+      </w:r>
+    </w:p>
+    <w:p>
+      <w:r>
+        <w:t xml:space="preserve">│       </w:t>
+      </w:r>
+      <w:r>
+        <w:rPr>
+          <w:rFonts w:ascii="MS Gothic" w:eastAsia="MS Gothic" w:hAnsi="MS Gothic" w:cs="MS Gothic" w:hint="eastAsia"/>
+        </w:rPr>
+        <w:t>├</w:t>
+      </w:r>
+      <w:r>
+        <w:rPr>
+          <w:rFonts w:ascii="Calibri" w:hAnsi="Calibri" w:cs="Calibri"/>
+        </w:rPr>
+        <w:t>──</w:t>
+      </w:r>
+      <w:r>
+        <w:t xml:space="preserve"> components/       # Sidebar, layout</w:t>
+      </w:r>
+    </w:p>
+    <w:p>
+      <w:r>
+        <w:t>│       └── pages/            # All 38 pages</w:t>
+      </w:r>
+    </w:p>
+    <w:p>
+      <w:r>
+        <w:t>│</w:t>
+      </w:r>
+    </w:p>
+    <w:p>
+      <w:r>
+        <w:rPr>
+          <w:rFonts w:ascii="MS Gothic" w:eastAsia="MS Gothic" w:hAnsi="MS Gothic" w:cs="MS Gothic" w:hint="eastAsia"/>
+        </w:rPr>
+        <w:t>├</w:t>
+      </w:r>
+      <w:r>
+        <w:rPr>
+          <w:rFonts w:ascii="Calibri" w:hAnsi="Calibri" w:cs="Calibri"/>
+        </w:rPr>
+        <w:t>──</w:t>
+      </w:r>
+      <w:r>
+        <w:t xml:space="preserve"> docker-</w:t>
+      </w:r>
+      <w:proofErr w:type="spellStart"/>
+      <w:r>
+        <w:t>compose.yml</w:t>
+      </w:r>
+      <w:proofErr w:type="spellEnd"/>
+      <w:r>
+        <w:t xml:space="preserve">        # PostgreSQL container</w:t>
+      </w:r>
+    </w:p>
+    <w:p>
+      <w:r>
+        <w:rPr>
+          <w:rFonts w:ascii="MS Gothic" w:eastAsia="MS Gothic" w:hAnsi="MS Gothic" w:cs="MS Gothic" w:hint="eastAsia"/>
+        </w:rPr>
+        <w:t>├</w:t>
+      </w:r>
+      <w:r>
+        <w:rPr>
+          <w:rFonts w:ascii="Calibri" w:hAnsi="Calibri" w:cs="Calibri"/>
+        </w:rPr>
+        <w:t>─</w:t>
+      </w:r>
+      <w:proofErr w:type="gramStart"/>
+      <w:r>
+        <w:rPr>
+          <w:rFonts w:ascii="Calibri" w:hAnsi="Calibri" w:cs="Calibri"/>
+        </w:rPr>
+        <w:t>─</w:t>
+      </w:r>
+      <w:r>
+        <w:t xml:space="preserve"> .</w:t>
+      </w:r>
+      <w:proofErr w:type="spellStart"/>
+      <w:r>
+        <w:t>gitignore</w:t>
+      </w:r>
+      <w:proofErr w:type="spellEnd"/>
+      <w:proofErr w:type="gramEnd"/>
+    </w:p>
+    <w:p>
+      <w:r>
+        <w:t>└── README.md</w:t>
+      </w:r>
+    </w:p>
+    <w:p>
+      <w:r>
+        <w:t>```</w:t>
+      </w:r>
+    </w:p>
+    <w:p/>
+    <w:p>
+      <w:r>
         <w:t>---</w:t>
       </w:r>
     </w:p>
     <w:p/>
     <w:p>
       <w:r>
-        <w:t>## Modules</w:t>
+        <w:t>## How to Run (Development)</w:t>
       </w:r>
     </w:p>
     <w:p/>
     <w:p>
       <w:r>
-        <w:t>| Module | What It Covers |</w:t>
-      </w:r>
-    </w:p>
-    <w:p>
-      <w:r>
-        <w:t>|---|---|</w:t>
-      </w:r>
-    </w:p>
-    <w:p>
-      <w:r>
-        <w:t>| **Master Data** | Items, Suppliers, Customers, Warehouses |</w:t>
-      </w:r>
-    </w:p>
-    <w:p>
-      <w:r>
-        <w:t>| **Inventory** | Stock levels, Stock movements (IN/OUT/TRANSFER) |</w:t>
-      </w:r>
-    </w:p>
-    <w:p>
-      <w:r>
-        <w:t>| **Purchasing** | Purchase Orders, Supplier management, Goods receipt |</w:t>
-      </w:r>
-    </w:p>
-    <w:p>
-      <w:r>
-        <w:t>| **Sales** | Sales Orders, Delivery, Invoice tracking |</w:t>
-      </w:r>
-    </w:p>
+        <w:t>### Prerequisites</w:t>
+      </w:r>
+    </w:p>
+    <w:p>
+      <w:r>
+        <w:t>- Docker Desktop installed and running</w:t>
+      </w:r>
+    </w:p>
+    <w:p>
+      <w:r>
+        <w:t>- Python 3.x installed</w:t>
+      </w:r>
+    </w:p>
+    <w:p>
+      <w:r>
+        <w:t xml:space="preserve">- Node.js + </w:t>
+      </w:r>
+      <w:proofErr w:type="spellStart"/>
+      <w:r>
+        <w:t>npm</w:t>
+      </w:r>
+      <w:proofErr w:type="spellEnd"/>
+      <w:r>
+        <w:t xml:space="preserve"> installed</w:t>
+      </w:r>
+    </w:p>
+    <w:p/>
     <w:p>
       <w:r>
         <w:lastRenderedPageBreak/>
-        <w:t>| **Finance** | Chart of Accounts, Journal Entries, Trial Balance |</w:t>
-      </w:r>
-    </w:p>
-    <w:p>
-      <w:r>
-        <w:t>| **HR &amp; Payroll** | Employees, Attendance, Monthly Salary processing |</w:t>
-      </w:r>
-    </w:p>
-    <w:p>
-      <w:r>
-        <w:t>| **Production** | Bill of Materials, Work Orders, Batch tracking |</w:t>
-      </w:r>
-    </w:p>
-    <w:p>
-      <w:r>
-        <w:t>| **Technical Textile** | Performance Specs, Samples, TDS, Testing Lab, R&amp;D Projects |</w:t>
-      </w:r>
-    </w:p>
-    <w:p>
-      <w:r>
-        <w:t>| **Medical Textile** | Regulatory Compliance, Batch Traceability, Sterility Records, CAPA, Audit Trail, Shelf Life |</w:t>
-      </w:r>
-    </w:p>
-    <w:p>
-      <w:r>
-        <w:t>| **Reports** | Production, Inventory, Sales, Finance, HR reports with charts |</w:t>
-      </w:r>
-    </w:p>
-    <w:p>
-      <w:r>
-        <w:t>| **Dashboard** | Live KPIs, alerts, charts from all modules |</w:t>
+        <w:t>### 1. Start the Database</w:t>
+      </w:r>
+    </w:p>
+    <w:p>
+      <w:r>
+        <w:t>```bash</w:t>
+      </w:r>
+    </w:p>
+    <w:p>
+      <w:r>
+        <w:t>docker-compose up -d</w:t>
+      </w:r>
+    </w:p>
+    <w:p>
+      <w:r>
+        <w:t>```</w:t>
       </w:r>
     </w:p>
     <w:p/>
     <w:p>
       <w:r>
-        <w:t>**Total: 38 pages across 11 modules**</w:t>
+        <w:t>### 2. Start the Backend</w:t>
+      </w:r>
+    </w:p>
+    <w:p>
+      <w:r>
+        <w:t>```bash</w:t>
+      </w:r>
+    </w:p>
+    <w:p>
+      <w:r>
+        <w:t>cd backend</w:t>
+      </w:r>
+    </w:p>
+    <w:p>
+      <w:r>
+        <w:t xml:space="preserve">python -m </w:t>
+      </w:r>
+      <w:proofErr w:type="spellStart"/>
+      <w:r>
+        <w:t>venv</w:t>
+      </w:r>
+      <w:proofErr w:type="spellEnd"/>
+      <w:r>
+        <w:t xml:space="preserve"> </w:t>
+      </w:r>
+      <w:proofErr w:type="spellStart"/>
+      <w:r>
+        <w:t>venv</w:t>
+      </w:r>
+      <w:proofErr w:type="spellEnd"/>
+    </w:p>
+    <w:p>
+      <w:proofErr w:type="spellStart"/>
+      <w:r>
+        <w:t>venv</w:t>
+      </w:r>
+      <w:proofErr w:type="spellEnd"/>
+      <w:r>
+        <w:t>\Scripts\activate          # Windows</w:t>
+      </w:r>
+    </w:p>
+    <w:p>
+      <w:r>
+        <w:t>pip install -r requirements.txt</w:t>
+      </w:r>
+    </w:p>
+    <w:p>
+      <w:r>
+        <w:t>python manage.py migrate</w:t>
+      </w:r>
+    </w:p>
+    <w:p>
+      <w:r>
+        <w:t xml:space="preserve">python manage.py </w:t>
+      </w:r>
+      <w:proofErr w:type="spellStart"/>
+      <w:r>
+        <w:t>runserver</w:t>
+      </w:r>
+      <w:proofErr w:type="spellEnd"/>
+    </w:p>
+    <w:p>
+      <w:r>
+        <w:t>```</w:t>
+      </w:r>
+    </w:p>
+    <w:p>
+      <w:r>
+        <w:t>Backend runs at: `http://127.0.0.1:8000`</w:t>
       </w:r>
     </w:p>
     <w:p/>
     <w:p>
       <w:r>
+        <w:t>### 3. Start the Frontend</w:t>
+      </w:r>
+    </w:p>
+    <w:p>
+      <w:r>
+        <w:t>```bash</w:t>
+      </w:r>
+    </w:p>
+    <w:p>
+      <w:r>
+        <w:t>cd frontend</w:t>
+      </w:r>
+    </w:p>
+    <w:p>
+      <w:proofErr w:type="spellStart"/>
+      <w:r>
+        <w:t>npm</w:t>
+      </w:r>
+      <w:proofErr w:type="spellEnd"/>
+      <w:r>
+        <w:t xml:space="preserve"> install</w:t>
+      </w:r>
+    </w:p>
+    <w:p>
+      <w:proofErr w:type="spellStart"/>
+      <w:r>
+        <w:t>npm</w:t>
+      </w:r>
+      <w:proofErr w:type="spellEnd"/>
+      <w:r>
+        <w:t xml:space="preserve"> start</w:t>
+      </w:r>
+    </w:p>
+    <w:p>
+      <w:r>
+        <w:t>```</w:t>
+      </w:r>
+    </w:p>
+    <w:p>
+      <w:r>
+        <w:t>Frontend runs at: `http://localhost:3000`</w:t>
+      </w:r>
+    </w:p>
+    <w:p/>
+    <w:p>
+      <w:r>
+        <w:t>### 4. Create Admin User (first time only)</w:t>
+      </w:r>
+    </w:p>
+    <w:p>
+      <w:r>
+        <w:t>```bash</w:t>
+      </w:r>
+    </w:p>
+    <w:p>
+      <w:r>
+        <w:t>cd backend</w:t>
+      </w:r>
+    </w:p>
+    <w:p>
+      <w:r>
+        <w:t xml:space="preserve">python manage.py </w:t>
+      </w:r>
+      <w:proofErr w:type="spellStart"/>
+      <w:r>
+        <w:t>createsuperuser</w:t>
+      </w:r>
+      <w:proofErr w:type="spellEnd"/>
+    </w:p>
+    <w:p>
+      <w:r>
+        <w:lastRenderedPageBreak/>
+        <w:t>```</w:t>
+      </w:r>
+    </w:p>
+    <w:p/>
+    <w:p>
+      <w:r>
         <w:t>---</w:t>
       </w:r>
     </w:p>
     <w:p/>
     <w:p>
       <w:r>
-        <w:t>## Tech Stack</w:t>
+        <w:t>## Key Features</w:t>
       </w:r>
     </w:p>
     <w:p/>
     <w:p>
       <w:r>
-        <w:t>### Frontend</w:t>
-      </w:r>
-    </w:p>
-    <w:p>
-      <w:r>
-        <w:t>- **React.js** — UI framework</w:t>
-      </w:r>
-    </w:p>
-    <w:p>
-      <w:r>
-        <w:t>- **Material UI (MUI)** — Component library</w:t>
-      </w:r>
-    </w:p>
-    <w:p>
-      <w:r>
-        <w:t>- **Recharts** — Charts and graphs</w:t>
-      </w:r>
-    </w:p>
-    <w:p>
-      <w:r>
-        <w:t>- **React Router** — Page routing</w:t>
+        <w:t>- **Live Dashboard** — KPI cards, charts, alerts from all modules in real time</w:t>
+      </w:r>
+    </w:p>
+    <w:p>
+      <w:r>
+        <w:t>- **Medical Compliance** — ISO 13485, FDA 510(k), CE Mark certificate tracking with expiry alerts</w:t>
+      </w:r>
+    </w:p>
+    <w:p>
+      <w:r>
+        <w:t>- **CAPA Management** — Corrective and Preventive Action tracking with open/closed status</w:t>
+      </w:r>
+    </w:p>
+    <w:p>
+      <w:r>
+        <w:t>- **Batch Traceability** — Full raw material → production → dispatch chain</w:t>
+      </w:r>
+    </w:p>
+    <w:p>
+      <w:r>
+        <w:t>- **</w:t>
+      </w:r>
+      <w:proofErr w:type="gramStart"/>
+      <w:r>
+        <w:t>Shelf Life</w:t>
+      </w:r>
+      <w:proofErr w:type="gramEnd"/>
+      <w:r>
+        <w:t xml:space="preserve"> Monitoring** — Auto-calculates days remaining, flags near-expiry batches</w:t>
+      </w:r>
+    </w:p>
+    <w:p>
+      <w:r>
+        <w:t>- **Audit Trail** — Every action auto-logged with user, timestamp, and module</w:t>
+      </w:r>
+    </w:p>
+    <w:p>
+      <w:r>
+        <w:t>- **BOM + Production** — Bill of Materials with waste percentage, work order completion updates stock automatically</w:t>
+      </w:r>
+    </w:p>
+    <w:p>
+      <w:r>
+        <w:t>- **Session Auth** — Secure login with Django session management</w:t>
       </w:r>
     </w:p>
     <w:p/>
     <w:p>
       <w:r>
-        <w:t>### Backend</w:t>
-      </w:r>
-    </w:p>
-    <w:p>
-      <w:r>
-        <w:t>- **Python 3.x** + **Django** — Web framework</w:t>
-      </w:r>
-    </w:p>
-    <w:p>
-      <w:r>
-        <w:t>- **Django REST Framework** — API layer</w:t>
-      </w:r>
-    </w:p>
-    <w:p>
-      <w:r>
-        <w:t>- **PostgreSQL** — Database</w:t>
+        <w:t>---</w:t>
       </w:r>
     </w:p>
     <w:p/>
     <w:p>
       <w:r>
-        <w:t>### Infrastructure</w:t>
-      </w:r>
-    </w:p>
-    <w:p>
-      <w:r>
-        <w:t>- **Docker + Docker Compose** — Runs PostgreSQL locally</w:t>
+        <w:t>## API Endpoints (Summary)</w:t>
+      </w:r>
+    </w:p>
+    <w:p/>
+    <w:p>
+      <w:r>
+        <w:t>All APIs follow the pattern: `http://127.0.0.1:8000/api/&lt;module&gt;/&lt;resource&gt;/`</w:t>
+      </w:r>
+    </w:p>
+    <w:p/>
+    <w:p>
+      <w:r>
+        <w:t>Examples:</w:t>
+      </w:r>
+    </w:p>
+    <w:p>
+      <w:r>
+        <w:t>- `GET /</w:t>
+      </w:r>
+      <w:proofErr w:type="spellStart"/>
+      <w:r>
+        <w:t>api</w:t>
+      </w:r>
+      <w:proofErr w:type="spellEnd"/>
+      <w:r>
+        <w:t>/authentication/dashboard-summary/` — Dashboard KPIs</w:t>
+      </w:r>
+    </w:p>
+    <w:p>
+      <w:r>
+        <w:t>- `GET/POST /</w:t>
+      </w:r>
+      <w:proofErr w:type="spellStart"/>
+      <w:r>
+        <w:t>api</w:t>
+      </w:r>
+      <w:proofErr w:type="spellEnd"/>
+      <w:r>
+        <w:t>/inventory/stock/` — Stock records</w:t>
+      </w:r>
+    </w:p>
+    <w:p>
+      <w:r>
+        <w:t>- `GET/POST /</w:t>
+      </w:r>
+      <w:proofErr w:type="spellStart"/>
+      <w:r>
+        <w:t>api</w:t>
+      </w:r>
+      <w:proofErr w:type="spellEnd"/>
+      <w:r>
+        <w:t>/purchasing/purchase-orders/` — Purchase orders</w:t>
+      </w:r>
+    </w:p>
+    <w:p>
+      <w:r>
+        <w:t>- `POST /</w:t>
+      </w:r>
+      <w:proofErr w:type="spellStart"/>
+      <w:r>
+        <w:t>api</w:t>
+      </w:r>
+      <w:proofErr w:type="spellEnd"/>
+      <w:r>
+        <w:t>/production/work-orders/&lt;id&gt;/complete/` — Complete a work order</w:t>
       </w:r>
     </w:p>
     <w:p>
       <w:r>
         <w:lastRenderedPageBreak/>
-        <w:t xml:space="preserve">- **Node.js + </w:t>
+        <w:t>- `GET /</w:t>
       </w:r>
       <w:proofErr w:type="spellStart"/>
       <w:r>
-        <w:t>npm</w:t>
+        <w:t>api</w:t>
       </w:r>
       <w:proofErr w:type="spellEnd"/>
       <w:r>
-        <w:t>** — React development server</w:t>
+        <w:t>/reports/sales/` — Sales report data</w:t>
       </w:r>
     </w:p>
     <w:p/>
@@ -18772,831 +19965,120 @@
     <w:p/>
     <w:p>
       <w:r>
-        <w:t>## Project Structure</w:t>
+        <w:t>## Roadmap (Phase 2)</w:t>
       </w:r>
     </w:p>
     <w:p/>
     <w:p>
       <w:r>
-        <w:t>```</w:t>
-      </w:r>
-    </w:p>
-    <w:p>
+        <w:t xml:space="preserve">- </w:t>
+      </w:r>
+      <w:proofErr w:type="gramStart"/>
+      <w:r>
+        <w:t>[ ]</w:t>
+      </w:r>
+      <w:proofErr w:type="gramEnd"/>
+      <w:r>
+        <w:t xml:space="preserve"> Role-based access control (Admin / Manager / Operator)</w:t>
+      </w:r>
+    </w:p>
+    <w:p>
+      <w:r>
+        <w:t xml:space="preserve">- </w:t>
+      </w:r>
+      <w:proofErr w:type="gramStart"/>
+      <w:r>
+        <w:t>[ ]</w:t>
+      </w:r>
+      <w:proofErr w:type="gramEnd"/>
+      <w:r>
+        <w:t xml:space="preserve"> Email notifications (expiring certs, overdue CAPAs)</w:t>
+      </w:r>
+    </w:p>
+    <w:p>
+      <w:r>
+        <w:t xml:space="preserve">- </w:t>
+      </w:r>
+      <w:proofErr w:type="gramStart"/>
+      <w:r>
+        <w:t>[ ]</w:t>
+      </w:r>
+      <w:proofErr w:type="gramEnd"/>
+      <w:r>
+        <w:t xml:space="preserve"> PDF export (Sales Orders, Salary Slips, TDS)</w:t>
+      </w:r>
+    </w:p>
+    <w:p>
+      <w:r>
+        <w:t xml:space="preserve">- </w:t>
+      </w:r>
+      <w:proofErr w:type="gramStart"/>
+      <w:r>
+        <w:t>[ ]</w:t>
+      </w:r>
+      <w:proofErr w:type="gramEnd"/>
+      <w:r>
+        <w:t xml:space="preserve"> File attachments (certificates, test reports)</w:t>
+      </w:r>
+    </w:p>
+    <w:p>
+      <w:r>
+        <w:t xml:space="preserve">- </w:t>
+      </w:r>
+      <w:proofErr w:type="gramStart"/>
+      <w:r>
+        <w:t>[ ]</w:t>
+      </w:r>
+      <w:proofErr w:type="gramEnd"/>
+      <w:r>
+        <w:t xml:space="preserve"> Barcode / QR scanning for stock movement</w:t>
+      </w:r>
+    </w:p>
+    <w:p>
+      <w:r>
+        <w:t xml:space="preserve">- </w:t>
+      </w:r>
+      <w:proofErr w:type="gramStart"/>
+      <w:r>
+        <w:t>[ ]</w:t>
+      </w:r>
+      <w:proofErr w:type="gramEnd"/>
+      <w:r>
+        <w:t xml:space="preserve"> Cloud deployment (AWS / </w:t>
+      </w:r>
       <w:proofErr w:type="spellStart"/>
       <w:r>
-        <w:t>SASI's_ERP</w:t>
+        <w:t>DigitalOcean</w:t>
       </w:r>
       <w:proofErr w:type="spellEnd"/>
       <w:r>
-        <w:t>/</w:t>
-      </w:r>
-    </w:p>
-    <w:p>
-      <w:r>
-        <w:rPr>
-          <w:rFonts w:ascii="MS Gothic" w:eastAsia="MS Gothic" w:hAnsi="MS Gothic" w:cs="MS Gothic" w:hint="eastAsia"/>
-        </w:rPr>
-        <w:t>├</w:t>
-      </w:r>
-      <w:r>
-        <w:rPr>
-          <w:rFonts w:ascii="Calibri" w:hAnsi="Calibri" w:cs="Calibri"/>
-        </w:rPr>
-        <w:t>──</w:t>
-      </w:r>
-      <w:r>
-        <w:t xml:space="preserve"> backend/                  # Django backend</w:t>
-      </w:r>
-    </w:p>
-    <w:p>
-      <w:r>
-        <w:t xml:space="preserve">│   </w:t>
-      </w:r>
-      <w:r>
-        <w:rPr>
-          <w:rFonts w:ascii="MS Gothic" w:eastAsia="MS Gothic" w:hAnsi="MS Gothic" w:cs="MS Gothic" w:hint="eastAsia"/>
-        </w:rPr>
-        <w:t>├</w:t>
-      </w:r>
-      <w:r>
-        <w:rPr>
-          <w:rFonts w:ascii="Calibri" w:hAnsi="Calibri" w:cs="Calibri"/>
-        </w:rPr>
-        <w:t>──</w:t>
-      </w:r>
-      <w:r>
-        <w:t xml:space="preserve"> core/                 # Settings, main URL router</w:t>
-      </w:r>
-    </w:p>
-    <w:p>
-      <w:r>
-        <w:t xml:space="preserve">│   </w:t>
-      </w:r>
-      <w:r>
-        <w:rPr>
-          <w:rFonts w:ascii="MS Gothic" w:eastAsia="MS Gothic" w:hAnsi="MS Gothic" w:cs="MS Gothic" w:hint="eastAsia"/>
-        </w:rPr>
-        <w:t>├</w:t>
-      </w:r>
-      <w:r>
-        <w:rPr>
-          <w:rFonts w:ascii="Calibri" w:hAnsi="Calibri" w:cs="Calibri"/>
-        </w:rPr>
-        <w:t>──</w:t>
-      </w:r>
-      <w:r>
-        <w:t xml:space="preserve"> authentication/       # Login, logout, dashboard API</w:t>
-      </w:r>
-    </w:p>
-    <w:p>
-      <w:r>
-        <w:t xml:space="preserve">│   </w:t>
-      </w:r>
-      <w:r>
-        <w:rPr>
-          <w:rFonts w:ascii="MS Gothic" w:eastAsia="MS Gothic" w:hAnsi="MS Gothic" w:cs="MS Gothic" w:hint="eastAsia"/>
-        </w:rPr>
-        <w:t>├</w:t>
-      </w:r>
-      <w:r>
-        <w:rPr>
-          <w:rFonts w:ascii="Calibri" w:hAnsi="Calibri" w:cs="Calibri"/>
-        </w:rPr>
-        <w:t>──</w:t>
-      </w:r>
-      <w:r>
-        <w:t xml:space="preserve"> inventory/            # Stock and movements</w:t>
-      </w:r>
-    </w:p>
-    <w:p>
-      <w:r>
-        <w:t xml:space="preserve">│   </w:t>
-      </w:r>
-      <w:r>
-        <w:rPr>
-          <w:rFonts w:ascii="MS Gothic" w:eastAsia="MS Gothic" w:hAnsi="MS Gothic" w:cs="MS Gothic" w:hint="eastAsia"/>
-        </w:rPr>
-        <w:t>├</w:t>
-      </w:r>
-      <w:r>
-        <w:rPr>
-          <w:rFonts w:ascii="Calibri" w:hAnsi="Calibri" w:cs="Calibri"/>
-        </w:rPr>
-        <w:t>──</w:t>
-      </w:r>
-      <w:r>
-        <w:t xml:space="preserve"> purchasing/           # Purchase orders</w:t>
-      </w:r>
-    </w:p>
-    <w:p>
-      <w:r>
-        <w:t xml:space="preserve">│   </w:t>
-      </w:r>
-      <w:r>
-        <w:rPr>
-          <w:rFonts w:ascii="MS Gothic" w:eastAsia="MS Gothic" w:hAnsi="MS Gothic" w:cs="MS Gothic" w:hint="eastAsia"/>
-        </w:rPr>
-        <w:t>├</w:t>
-      </w:r>
-      <w:r>
-        <w:rPr>
-          <w:rFonts w:ascii="Calibri" w:hAnsi="Calibri" w:cs="Calibri"/>
-        </w:rPr>
-        <w:t>──</w:t>
-      </w:r>
-      <w:r>
-        <w:t xml:space="preserve"> sales/                # Sales orders and invoices</w:t>
-      </w:r>
-    </w:p>
-    <w:p>
-      <w:r>
-        <w:t xml:space="preserve">│   </w:t>
-      </w:r>
-      <w:r>
-        <w:rPr>
-          <w:rFonts w:ascii="MS Gothic" w:eastAsia="MS Gothic" w:hAnsi="MS Gothic" w:cs="MS Gothic" w:hint="eastAsia"/>
-        </w:rPr>
-        <w:t>├</w:t>
-      </w:r>
-      <w:r>
-        <w:rPr>
-          <w:rFonts w:ascii="Calibri" w:hAnsi="Calibri" w:cs="Calibri"/>
-        </w:rPr>
-        <w:t>──</w:t>
-      </w:r>
-      <w:r>
-        <w:t xml:space="preserve"> finance/              # Accounts and journals</w:t>
-      </w:r>
-    </w:p>
-    <w:p>
-      <w:r>
-        <w:t xml:space="preserve">│   </w:t>
-      </w:r>
-      <w:r>
-        <w:rPr>
-          <w:rFonts w:ascii="MS Gothic" w:eastAsia="MS Gothic" w:hAnsi="MS Gothic" w:cs="MS Gothic" w:hint="eastAsia"/>
-        </w:rPr>
-        <w:t>├</w:t>
-      </w:r>
-      <w:r>
-        <w:rPr>
-          <w:rFonts w:ascii="Calibri" w:hAnsi="Calibri" w:cs="Calibri"/>
-        </w:rPr>
-        <w:t>──</w:t>
-      </w:r>
-      <w:r>
-        <w:t xml:space="preserve"> </w:t>
-      </w:r>
-      <w:proofErr w:type="spellStart"/>
-      <w:r>
-        <w:t>hr_payroll</w:t>
-      </w:r>
-      <w:proofErr w:type="spellEnd"/>
-      <w:r>
-        <w:t>/           # Employees, attendance, salary</w:t>
-      </w:r>
-    </w:p>
-    <w:p>
-      <w:r>
-        <w:t xml:space="preserve">│   </w:t>
-      </w:r>
-      <w:r>
-        <w:rPr>
-          <w:rFonts w:ascii="MS Gothic" w:eastAsia="MS Gothic" w:hAnsi="MS Gothic" w:cs="MS Gothic" w:hint="eastAsia"/>
-        </w:rPr>
-        <w:t>├</w:t>
-      </w:r>
-      <w:r>
-        <w:rPr>
-          <w:rFonts w:ascii="Calibri" w:hAnsi="Calibri" w:cs="Calibri"/>
-        </w:rPr>
-        <w:t>──</w:t>
-      </w:r>
-      <w:r>
-        <w:t xml:space="preserve"> production/           # BOM and work orders</w:t>
-      </w:r>
-    </w:p>
-    <w:p>
-      <w:r>
-        <w:t xml:space="preserve">│   </w:t>
-      </w:r>
-      <w:r>
-        <w:rPr>
-          <w:rFonts w:ascii="MS Gothic" w:eastAsia="MS Gothic" w:hAnsi="MS Gothic" w:cs="MS Gothic" w:hint="eastAsia"/>
-        </w:rPr>
-        <w:t>├</w:t>
-      </w:r>
-      <w:r>
-        <w:rPr>
-          <w:rFonts w:ascii="Calibri" w:hAnsi="Calibri" w:cs="Calibri"/>
-        </w:rPr>
-        <w:t>──</w:t>
-      </w:r>
-      <w:r>
-        <w:t xml:space="preserve"> </w:t>
-      </w:r>
-      <w:proofErr w:type="spellStart"/>
-      <w:r>
-        <w:t>technical_textile</w:t>
-      </w:r>
-      <w:proofErr w:type="spellEnd"/>
-      <w:r>
-        <w:t>/    # Specs, samples, lab, R&amp;D</w:t>
-      </w:r>
-    </w:p>
-    <w:p>
-      <w:r>
-        <w:t xml:space="preserve">│   </w:t>
-      </w:r>
-      <w:r>
-        <w:rPr>
-          <w:rFonts w:ascii="MS Gothic" w:eastAsia="MS Gothic" w:hAnsi="MS Gothic" w:cs="MS Gothic" w:hint="eastAsia"/>
-        </w:rPr>
-        <w:t>├</w:t>
-      </w:r>
-      <w:r>
-        <w:rPr>
-          <w:rFonts w:ascii="Calibri" w:hAnsi="Calibri" w:cs="Calibri"/>
-        </w:rPr>
-        <w:t>──</w:t>
-      </w:r>
-      <w:r>
-        <w:t xml:space="preserve"> </w:t>
-      </w:r>
-      <w:proofErr w:type="spellStart"/>
-      <w:r>
-        <w:t>medical_textile</w:t>
-      </w:r>
-      <w:proofErr w:type="spellEnd"/>
-      <w:r>
-        <w:t>/      # Compliance, CAPA, traceability</w:t>
-      </w:r>
-    </w:p>
-    <w:p>
-      <w:r>
-        <w:t>│   └── reports/              # Report APIs</w:t>
-      </w:r>
-    </w:p>
-    <w:p>
-      <w:r>
-        <w:t>│</w:t>
-      </w:r>
-    </w:p>
-    <w:p>
-      <w:r>
-        <w:rPr>
-          <w:rFonts w:ascii="MS Gothic" w:eastAsia="MS Gothic" w:hAnsi="MS Gothic" w:cs="MS Gothic" w:hint="eastAsia"/>
-        </w:rPr>
-        <w:t>├</w:t>
-      </w:r>
-      <w:r>
-        <w:rPr>
-          <w:rFonts w:ascii="Calibri" w:hAnsi="Calibri" w:cs="Calibri"/>
-        </w:rPr>
-        <w:t>──</w:t>
-      </w:r>
-      <w:r>
-        <w:t xml:space="preserve"> frontend/                 # React frontend</w:t>
-      </w:r>
-    </w:p>
-    <w:p>
-      <w:r>
-        <w:t xml:space="preserve">│   └── </w:t>
-      </w:r>
-      <w:proofErr w:type="spellStart"/>
-      <w:r>
-        <w:t>src</w:t>
-      </w:r>
-      <w:proofErr w:type="spellEnd"/>
-      <w:r>
-        <w:t>/</w:t>
-      </w:r>
-    </w:p>
-    <w:p>
-      <w:r>
-        <w:t xml:space="preserve">│       </w:t>
-      </w:r>
-      <w:r>
-        <w:rPr>
-          <w:rFonts w:ascii="MS Gothic" w:eastAsia="MS Gothic" w:hAnsi="MS Gothic" w:cs="MS Gothic" w:hint="eastAsia"/>
-        </w:rPr>
-        <w:t>├</w:t>
-      </w:r>
-      <w:r>
-        <w:rPr>
-          <w:rFonts w:ascii="Calibri" w:hAnsi="Calibri" w:cs="Calibri"/>
-        </w:rPr>
-        <w:t>──</w:t>
-      </w:r>
-      <w:r>
-        <w:t xml:space="preserve"> App.js            # All routes</w:t>
-      </w:r>
-    </w:p>
-    <w:p>
-      <w:r>
-        <w:t xml:space="preserve">│       </w:t>
-      </w:r>
-      <w:r>
-        <w:rPr>
-          <w:rFonts w:ascii="MS Gothic" w:eastAsia="MS Gothic" w:hAnsi="MS Gothic" w:cs="MS Gothic" w:hint="eastAsia"/>
-        </w:rPr>
-        <w:t>├</w:t>
-      </w:r>
-      <w:r>
-        <w:rPr>
-          <w:rFonts w:ascii="Calibri" w:hAnsi="Calibri" w:cs="Calibri"/>
-        </w:rPr>
-        <w:t>──</w:t>
-      </w:r>
-      <w:r>
-        <w:t xml:space="preserve"> components/       # Sidebar, layout</w:t>
-      </w:r>
-    </w:p>
-    <w:p>
-      <w:r>
-        <w:t>│       └── pages/            # All 38 pages</w:t>
-      </w:r>
-    </w:p>
-    <w:p>
-      <w:r>
-        <w:t>│</w:t>
-      </w:r>
-    </w:p>
-    <w:p>
-      <w:r>
-        <w:rPr>
-          <w:rFonts w:ascii="MS Gothic" w:eastAsia="MS Gothic" w:hAnsi="MS Gothic" w:cs="MS Gothic" w:hint="eastAsia"/>
-        </w:rPr>
-        <w:lastRenderedPageBreak/>
-        <w:t>├</w:t>
-      </w:r>
-      <w:r>
-        <w:rPr>
-          <w:rFonts w:ascii="Calibri" w:hAnsi="Calibri" w:cs="Calibri"/>
-        </w:rPr>
-        <w:t>──</w:t>
-      </w:r>
-      <w:r>
-        <w:t xml:space="preserve"> docker-</w:t>
-      </w:r>
-      <w:proofErr w:type="spellStart"/>
-      <w:r>
-        <w:t>compose.yml</w:t>
-      </w:r>
-      <w:proofErr w:type="spellEnd"/>
-      <w:r>
-        <w:t xml:space="preserve">        # PostgreSQL container</w:t>
-      </w:r>
-    </w:p>
-    <w:p>
-      <w:r>
-        <w:rPr>
-          <w:rFonts w:ascii="MS Gothic" w:eastAsia="MS Gothic" w:hAnsi="MS Gothic" w:cs="MS Gothic" w:hint="eastAsia"/>
-        </w:rPr>
-        <w:t>├</w:t>
-      </w:r>
-      <w:r>
-        <w:rPr>
-          <w:rFonts w:ascii="Calibri" w:hAnsi="Calibri" w:cs="Calibri"/>
-        </w:rPr>
-        <w:t>──</w:t>
-      </w:r>
-      <w:r>
-        <w:t xml:space="preserve"> .</w:t>
-      </w:r>
-      <w:proofErr w:type="spellStart"/>
-      <w:r>
-        <w:t>gitignore</w:t>
-      </w:r>
-      <w:proofErr w:type="spellEnd"/>
-    </w:p>
-    <w:p>
-      <w:r>
-        <w:t>└── README.md</w:t>
-      </w:r>
-    </w:p>
-    <w:p>
-      <w:r>
-        <w:t>```</w:t>
-      </w:r>
-    </w:p>
-    <w:p/>
-    <w:p>
-      <w:r>
-        <w:t>---</w:t>
-      </w:r>
-    </w:p>
-    <w:p/>
-    <w:p>
-      <w:r>
-        <w:t>## How to Run (Development)</w:t>
-      </w:r>
-    </w:p>
-    <w:p/>
-    <w:p>
-      <w:r>
-        <w:t>### Prerequisites</w:t>
-      </w:r>
-    </w:p>
-    <w:p>
-      <w:r>
-        <w:t>- Docker Desktop installed and running</w:t>
-      </w:r>
-    </w:p>
-    <w:p>
-      <w:r>
-        <w:t>- Python 3.x installed</w:t>
-      </w:r>
-    </w:p>
-    <w:p>
-      <w:r>
-        <w:t xml:space="preserve">- Node.js + </w:t>
-      </w:r>
-      <w:proofErr w:type="spellStart"/>
-      <w:r>
-        <w:t>npm</w:t>
-      </w:r>
-      <w:proofErr w:type="spellEnd"/>
-      <w:r>
-        <w:t xml:space="preserve"> installed</w:t>
-      </w:r>
-    </w:p>
-    <w:p/>
-    <w:p>
-      <w:r>
-        <w:t>### 1. Start the Database</w:t>
-      </w:r>
-    </w:p>
-    <w:p>
-      <w:r>
-        <w:t>```bash</w:t>
-      </w:r>
-    </w:p>
-    <w:p>
-      <w:r>
-        <w:t>docker-compose up -d</w:t>
-      </w:r>
-    </w:p>
-    <w:p>
-      <w:r>
-        <w:t>```</w:t>
-      </w:r>
-    </w:p>
-    <w:p/>
-    <w:p>
-      <w:r>
-        <w:t>### 2. Start the Backend</w:t>
-      </w:r>
-    </w:p>
-    <w:p>
-      <w:r>
-        <w:t>```bash</w:t>
-      </w:r>
-    </w:p>
-    <w:p>
-      <w:r>
-        <w:t>cd backend</w:t>
-      </w:r>
-    </w:p>
-    <w:p>
-      <w:r>
-        <w:t xml:space="preserve">python -m </w:t>
-      </w:r>
-      <w:proofErr w:type="spellStart"/>
-      <w:r>
-        <w:t>venv</w:t>
-      </w:r>
-      <w:proofErr w:type="spellEnd"/>
-      <w:r>
-        <w:t xml:space="preserve"> </w:t>
-      </w:r>
-      <w:proofErr w:type="spellStart"/>
-      <w:r>
-        <w:t>venv</w:t>
-      </w:r>
-      <w:proofErr w:type="spellEnd"/>
-    </w:p>
-    <w:p>
-      <w:proofErr w:type="spellStart"/>
-      <w:r>
-        <w:t>venv</w:t>
-      </w:r>
-      <w:proofErr w:type="spellEnd"/>
-      <w:r>
-        <w:t>\Scripts\activate          # Windows</w:t>
-      </w:r>
-    </w:p>
-    <w:p>
-      <w:r>
-        <w:t>pip install -r requirements.txt</w:t>
-      </w:r>
-    </w:p>
-    <w:p>
-      <w:r>
-        <w:t>python manage.py migrate</w:t>
-      </w:r>
-    </w:p>
-    <w:p>
-      <w:r>
-        <w:t xml:space="preserve">python manage.py </w:t>
-      </w:r>
-      <w:proofErr w:type="spellStart"/>
-      <w:r>
-        <w:t>runserver</w:t>
-      </w:r>
-      <w:proofErr w:type="spellEnd"/>
-    </w:p>
-    <w:p>
-      <w:r>
-        <w:t>```</w:t>
-      </w:r>
-    </w:p>
-    <w:p>
-      <w:r>
-        <w:lastRenderedPageBreak/>
-        <w:t>Backend runs at: `http://127.0.0.1:8000`</w:t>
-      </w:r>
-    </w:p>
-    <w:p/>
-    <w:p>
-      <w:r>
-        <w:t>### 3. Start the Frontend</w:t>
-      </w:r>
-    </w:p>
-    <w:p>
-      <w:r>
-        <w:t>```bash</w:t>
-      </w:r>
-    </w:p>
-    <w:p>
-      <w:r>
-        <w:t>cd frontend</w:t>
-      </w:r>
-    </w:p>
-    <w:p>
-      <w:proofErr w:type="spellStart"/>
-      <w:r>
-        <w:t>npm</w:t>
-      </w:r>
-      <w:proofErr w:type="spellEnd"/>
-      <w:r>
-        <w:t xml:space="preserve"> install</w:t>
-      </w:r>
-    </w:p>
-    <w:p>
-      <w:proofErr w:type="spellStart"/>
-      <w:r>
-        <w:t>npm</w:t>
-      </w:r>
-      <w:proofErr w:type="spellEnd"/>
-      <w:r>
-        <w:t xml:space="preserve"> start</w:t>
-      </w:r>
-    </w:p>
-    <w:p>
-      <w:r>
-        <w:t>```</w:t>
-      </w:r>
-    </w:p>
-    <w:p>
-      <w:r>
-        <w:t>Frontend runs at: `http://localhost:3000`</w:t>
-      </w:r>
-    </w:p>
-    <w:p/>
-    <w:p>
-      <w:r>
-        <w:t>### 4. Create Admin User (first time only)</w:t>
-      </w:r>
-    </w:p>
-    <w:p>
-      <w:r>
-        <w:t>```bash</w:t>
-      </w:r>
-    </w:p>
-    <w:p>
-      <w:r>
-        <w:t>cd backend</w:t>
-      </w:r>
-    </w:p>
-    <w:p>
-      <w:r>
-        <w:t xml:space="preserve">python manage.py </w:t>
-      </w:r>
-      <w:proofErr w:type="spellStart"/>
-      <w:r>
-        <w:t>createsuperuser</w:t>
-      </w:r>
-      <w:proofErr w:type="spellEnd"/>
-    </w:p>
-    <w:p>
-      <w:r>
-        <w:t>```</w:t>
-      </w:r>
-    </w:p>
-    <w:p/>
-    <w:p>
-      <w:r>
-        <w:t>---</w:t>
-      </w:r>
-    </w:p>
-    <w:p/>
-    <w:p>
-      <w:r>
-        <w:t>## Key Features</w:t>
-      </w:r>
-    </w:p>
-    <w:p/>
-    <w:p>
-      <w:r>
-        <w:t>- **Live Dashboard** — KPI cards, charts, alerts from all modules in real time</w:t>
-      </w:r>
-    </w:p>
-    <w:p>
-      <w:r>
-        <w:t>- **Medical Compliance** — ISO 13485, FDA 510(k), CE Mark certificate tracking with expiry alerts</w:t>
-      </w:r>
-    </w:p>
-    <w:p>
-      <w:r>
-        <w:t>- **CAPA Management** — Corrective and Preventive Action tracking with open/closed status</w:t>
-      </w:r>
-    </w:p>
-    <w:p>
-      <w:r>
-        <w:t>- **Batch Traceability** — Full raw material → production → dispatch chain</w:t>
-      </w:r>
-    </w:p>
-    <w:p>
-      <w:r>
-        <w:t>- **Shelf Life Monitoring** — Auto-calculates days remaining, flags near-expiry batches</w:t>
-      </w:r>
-    </w:p>
-    <w:p>
-      <w:r>
-        <w:t>- **Audit Trail** — Every action auto-logged with user, timestamp, and module</w:t>
-      </w:r>
-    </w:p>
-    <w:p>
-      <w:r>
-        <w:lastRenderedPageBreak/>
-        <w:t>- **BOM + Production** — Bill of Materials with waste percentage, work order completion updates stock automatically</w:t>
-      </w:r>
-    </w:p>
-    <w:p>
-      <w:r>
-        <w:t>- **Session Auth** — Secure login with Django session management</w:t>
-      </w:r>
-    </w:p>
-    <w:p/>
-    <w:p>
-      <w:r>
-        <w:t>---</w:t>
-      </w:r>
-    </w:p>
-    <w:p/>
-    <w:p>
-      <w:r>
-        <w:t>## API Endpoints (Summary)</w:t>
-      </w:r>
-    </w:p>
-    <w:p/>
-    <w:p>
-      <w:r>
-        <w:t>All APIs follow the pattern: `http://127.0.0.1:8000/api/&lt;module&gt;/&lt;resource&gt;/`</w:t>
-      </w:r>
-    </w:p>
-    <w:p/>
-    <w:p>
-      <w:r>
-        <w:t>Examples:</w:t>
-      </w:r>
-    </w:p>
-    <w:p>
-      <w:r>
-        <w:t>- `GET /</w:t>
-      </w:r>
-      <w:proofErr w:type="spellStart"/>
-      <w:r>
-        <w:t>api</w:t>
-      </w:r>
-      <w:proofErr w:type="spellEnd"/>
-      <w:r>
-        <w:t>/authentication/dashboard-summary/` — Dashboard KPIs</w:t>
-      </w:r>
-    </w:p>
-    <w:p>
-      <w:r>
-        <w:t>- `GET/POST /</w:t>
-      </w:r>
-      <w:proofErr w:type="spellStart"/>
-      <w:r>
-        <w:t>api</w:t>
-      </w:r>
-      <w:proofErr w:type="spellEnd"/>
-      <w:r>
-        <w:t>/inventory/stock/` — Stock records</w:t>
-      </w:r>
-    </w:p>
-    <w:p>
-      <w:r>
-        <w:t>- `GET/POST /</w:t>
-      </w:r>
-      <w:proofErr w:type="spellStart"/>
-      <w:r>
-        <w:t>api</w:t>
-      </w:r>
-      <w:proofErr w:type="spellEnd"/>
-      <w:r>
-        <w:t>/purchasing/purchase-orders/` — Purchase orders</w:t>
-      </w:r>
-    </w:p>
-    <w:p>
-      <w:r>
-        <w:t>- `POST /</w:t>
-      </w:r>
-      <w:proofErr w:type="spellStart"/>
-      <w:r>
-        <w:t>api</w:t>
-      </w:r>
-      <w:proofErr w:type="spellEnd"/>
-      <w:r>
-        <w:t>/production/work-orders/&lt;id&gt;/complete/` — Complete a work order</w:t>
-      </w:r>
-    </w:p>
-    <w:p>
-      <w:r>
-        <w:t>- `GET /</w:t>
-      </w:r>
-      <w:proofErr w:type="spellStart"/>
-      <w:r>
-        <w:t>api</w:t>
-      </w:r>
-      <w:proofErr w:type="spellEnd"/>
-      <w:r>
-        <w:t>/reports/sales/` — Sales report data</w:t>
-      </w:r>
-    </w:p>
-    <w:p/>
-    <w:p>
-      <w:r>
-        <w:t>---</w:t>
-      </w:r>
-    </w:p>
-    <w:p/>
-    <w:p>
-      <w:r>
-        <w:t>## Roadmap (Phase 2)</w:t>
-      </w:r>
-    </w:p>
-    <w:p/>
-    <w:p>
-      <w:r>
-        <w:t>- [ ] Role-based access control (Admin / Manager / Operator)</w:t>
-      </w:r>
-    </w:p>
-    <w:p>
-      <w:r>
-        <w:t>- [ ] Email notifications (expiring certs, overdue CAPAs)</w:t>
-      </w:r>
-    </w:p>
-    <w:p>
-      <w:r>
-        <w:t>- [ ] PDF export (Sales Orders, Salary Slips, TDS)</w:t>
-      </w:r>
-    </w:p>
-    <w:p>
-      <w:r>
-        <w:t>- [ ] File attachments (certificates, test reports)</w:t>
-      </w:r>
-    </w:p>
-    <w:p>
-      <w:r>
-        <w:t>- [ ] Barcode / QR scanning for stock movement</w:t>
-      </w:r>
-    </w:p>
-    <w:p>
-      <w:r>
-        <w:t xml:space="preserve">- [ ] Cloud deployment (AWS / </w:t>
-      </w:r>
-      <w:proofErr w:type="spellStart"/>
-      <w:r>
-        <w:t>DigitalOcean</w:t>
-      </w:r>
-      <w:proofErr w:type="spellEnd"/>
-      <w:r>
         <w:t>)</w:t>
       </w:r>
     </w:p>
     <w:p>
       <w:r>
-        <w:t>- [ ] Mobile-friendly warehouse interface</w:t>
-      </w:r>
-    </w:p>
-    <w:p>
-      <w:r>
-        <w:lastRenderedPageBreak/>
-        <w:t>- [ ] Multi-company support</w:t>
+        <w:t xml:space="preserve">- </w:t>
+      </w:r>
+      <w:proofErr w:type="gramStart"/>
+      <w:r>
+        <w:t>[ ]</w:t>
+      </w:r>
+      <w:proofErr w:type="gramEnd"/>
+      <w:r>
+        <w:t xml:space="preserve"> Mobile-friendly warehouse interface</w:t>
+      </w:r>
+    </w:p>
+    <w:p>
+      <w:r>
+        <w:t xml:space="preserve">- </w:t>
+      </w:r>
+      <w:proofErr w:type="gramStart"/>
+      <w:r>
+        <w:t>[ ]</w:t>
+      </w:r>
+      <w:proofErr w:type="gramEnd"/>
+      <w:r>
+        <w:t xml:space="preserve"> Multi-company support</w:t>
       </w:r>
     </w:p>
     <w:p/>
@@ -19648,7 +20130,15 @@
         <w:br/>
       </w:r>
       <w:r>
-        <w:t>Good — now I have everything. I'll create 4 files and update 2 existing ones.</w:t>
+        <w:t xml:space="preserve">Good — now I have everything. </w:t>
+      </w:r>
+      <w:proofErr w:type="gramStart"/>
+      <w:r>
+        <w:t>I'll</w:t>
+      </w:r>
+      <w:proofErr w:type="gramEnd"/>
+      <w:r>
+        <w:t xml:space="preserve"> create 4 files and update 2 existing ones.</w:t>
       </w:r>
     </w:p>
     <w:p>
@@ -19690,13 +20180,18 @@
     </w:p>
     <w:p>
       <w:r>
-        <w:t>Now write a .</w:t>
+        <w:t xml:space="preserve">Now write </w:t>
+      </w:r>
+      <w:proofErr w:type="gramStart"/>
+      <w:r>
+        <w:t>a .</w:t>
       </w:r>
       <w:proofErr w:type="spellStart"/>
       <w:r>
         <w:t>gitignore</w:t>
       </w:r>
       <w:proofErr w:type="spellEnd"/>
+      <w:proofErr w:type="gramEnd"/>
       <w:r>
         <w:t xml:space="preserve"> at root so </w:t>
       </w:r>
@@ -19714,18 +20209,31 @@
       </w:r>
       <w:proofErr w:type="spellEnd"/>
       <w:r>
-        <w:t xml:space="preserve"> don't get pushed to GitHub:</w:t>
-      </w:r>
-    </w:p>
-    <w:p>
-      <w:r>
-        <w:t>Good — .</w:t>
+        <w:t xml:space="preserve"> </w:t>
+      </w:r>
+      <w:proofErr w:type="gramStart"/>
+      <w:r>
+        <w:t>don't</w:t>
+      </w:r>
+      <w:proofErr w:type="gramEnd"/>
+      <w:r>
+        <w:t xml:space="preserve"> get pushed to GitHub:</w:t>
+      </w:r>
+    </w:p>
+    <w:p>
+      <w:r>
+        <w:t xml:space="preserve">Good </w:t>
+      </w:r>
+      <w:proofErr w:type="gramStart"/>
+      <w:r>
+        <w:t>— .</w:t>
       </w:r>
       <w:proofErr w:type="spellStart"/>
       <w:r>
         <w:t>gitignore</w:t>
       </w:r>
       <w:proofErr w:type="spellEnd"/>
+      <w:proofErr w:type="gramEnd"/>
       <w:r>
         <w:t xml:space="preserve"> already covers everything needed. Also need to add </w:t>
       </w:r>
@@ -19748,15 +20256,23 @@
     <w:p/>
     <w:p>
       <w:r>
-        <w:lastRenderedPageBreak/>
         <w:t xml:space="preserve">All files are ready. Now here is your </w:t>
       </w:r>
+      <w:proofErr w:type="gramStart"/>
       <w:r>
         <w:rPr>
           <w:b/>
           <w:bCs/>
         </w:rPr>
-        <w:t>step by step guide</w:t>
+        <w:t>step by step</w:t>
+      </w:r>
+      <w:proofErr w:type="gramEnd"/>
+      <w:r>
+        <w:rPr>
+          <w:b/>
+          <w:bCs/>
+        </w:rPr>
+        <w:t xml:space="preserve"> guide</w:t>
       </w:r>
       <w:r>
         <w:t xml:space="preserve"> to go live:</w:t>
@@ -19765,7 +20281,7 @@
     <w:p>
       <w:r>
         <w:pict w14:anchorId="5DFB1AAB">
-          <v:rect id="_x0000_i1079" style="width:0;height:1.5pt" o:hralign="center" o:hrstd="t" o:hr="t" fillcolor="#a0a0a0" stroked="f"/>
+          <v:rect id="_x0000_i1043" style="width:0;height:1.5pt" o:hralign="center" o:hrstd="t" o:hr="t" fillcolor="#a0a0a0" stroked="f"/>
         </w:pict>
       </w:r>
     </w:p>
@@ -19823,8 +20339,13 @@
     </w:p>
     <w:p>
       <w:r>
-        <w:t>git add .</w:t>
-      </w:r>
+        <w:t xml:space="preserve">git </w:t>
+      </w:r>
+      <w:proofErr w:type="gramStart"/>
+      <w:r>
+        <w:t>add .</w:t>
+      </w:r>
+      <w:proofErr w:type="gramEnd"/>
     </w:p>
     <w:p>
       <w:r>
@@ -19844,7 +20365,7 @@
     <w:p>
       <w:r>
         <w:pict w14:anchorId="053AF0FC">
-          <v:rect id="_x0000_i1080" style="width:0;height:1.5pt" o:hralign="center" o:hrstd="t" o:hr="t" fillcolor="#a0a0a0" stroked="f"/>
+          <v:rect id="_x0000_i1044" style="width:0;height:1.5pt" o:hralign="center" o:hrstd="t" o:hr="t" fillcolor="#a0a0a0" stroked="f"/>
         </w:pict>
       </w:r>
     </w:p>
@@ -19881,7 +20402,7 @@
     <w:p>
       <w:r>
         <w:pict w14:anchorId="413BA560">
-          <v:rect id="_x0000_i1081" style="width:0;height:1.5pt" o:hralign="center" o:hrstd="t" o:hr="t" fillcolor="#a0a0a0" stroked="f"/>
+          <v:rect id="_x0000_i1045" style="width:0;height:1.5pt" o:hralign="center" o:hrstd="t" o:hr="t" fillcolor="#a0a0a0" stroked="f"/>
         </w:pict>
       </w:r>
     </w:p>
@@ -19936,6 +20457,7 @@
         </w:numPr>
       </w:pPr>
       <w:r>
+        <w:lastRenderedPageBreak/>
         <w:t>Connect your GitHub repo </w:t>
       </w:r>
       <w:proofErr w:type="spellStart"/>
@@ -19955,10 +20477,12 @@
         <w:t>Render reads </w:t>
       </w:r>
       <w:proofErr w:type="spellStart"/>
+      <w:proofErr w:type="gramStart"/>
       <w:r>
         <w:t>render.yaml</w:t>
       </w:r>
       <w:proofErr w:type="spellEnd"/>
+      <w:proofErr w:type="gramEnd"/>
       <w:r>
         <w:t> automatically</w:t>
       </w:r>
@@ -19987,7 +20511,7 @@
     <w:p>
       <w:r>
         <w:pict w14:anchorId="284425B3">
-          <v:rect id="_x0000_i1082" style="width:0;height:1.5pt" o:hralign="center" o:hrstd="t" o:hr="t" fillcolor="#a0a0a0" stroked="f"/>
+          <v:rect id="_x0000_i1046" style="width:0;height:1.5pt" o:hralign="center" o:hrstd="t" o:hr="t" fillcolor="#a0a0a0" stroked="f"/>
         </w:pict>
       </w:r>
     </w:p>
@@ -20039,7 +20563,7 @@
     <w:p>
       <w:r>
         <w:pict w14:anchorId="596704FD">
-          <v:rect id="_x0000_i1083" style="width:0;height:1.5pt" o:hralign="center" o:hrstd="t" o:hr="t" fillcolor="#a0a0a0" stroked="f"/>
+          <v:rect id="_x0000_i1047" style="width:0;height:1.5pt" o:hralign="center" o:hrstd="t" o:hr="t" fillcolor="#a0a0a0" stroked="f"/>
         </w:pict>
       </w:r>
     </w:p>
@@ -20071,7 +20595,7 @@
     <w:p>
       <w:r>
         <w:pict w14:anchorId="60374A41">
-          <v:rect id="_x0000_i1084" style="width:0;height:1.5pt" o:hralign="center" o:hrstd="t" o:hr="t" fillcolor="#a0a0a0" stroked="f"/>
+          <v:rect id="_x0000_i1048" style="width:0;height:1.5pt" o:hralign="center" o:hrstd="t" o:hr="t" fillcolor="#a0a0a0" stroked="f"/>
         </w:pict>
       </w:r>
     </w:p>
@@ -20081,8 +20605,23 @@
           <w:b/>
           <w:bCs/>
         </w:rPr>
-        <w:lastRenderedPageBreak/>
-        <w:t>First time build takes ~5 minutes. After that it's live 24/7.</w:t>
+        <w:t xml:space="preserve">First time build takes ~5 minutes. After that </w:t>
+      </w:r>
+      <w:proofErr w:type="gramStart"/>
+      <w:r>
+        <w:rPr>
+          <w:b/>
+          <w:bCs/>
+        </w:rPr>
+        <w:t>it's</w:t>
+      </w:r>
+      <w:proofErr w:type="gramEnd"/>
+      <w:r>
+        <w:rPr>
+          <w:b/>
+          <w:bCs/>
+        </w:rPr>
+        <w:t xml:space="preserve"> live 24/7.</w:t>
       </w:r>
     </w:p>
     <w:p>
@@ -20090,6 +20629,7 @@
         <w:t>Do you have a GitHub account already?</w:t>
       </w:r>
     </w:p>
+    <w:p/>
     <w:p>
       <w:pPr>
         <w:rPr>
@@ -22061,6 +22601,7 @@
   <w:style w:type="character" w:default="1" w:styleId="DefaultParagraphFont">
     <w:name w:val="Default Paragraph Font"/>
     <w:uiPriority w:val="1"/>
+    <w:semiHidden/>
     <w:unhideWhenUsed/>
   </w:style>
   <w:style w:type="table" w:default="1" w:styleId="TableNormal">

</xml_diff>